<commit_message>
Implement attendance backlog features
</commit_message>
<xml_diff>
--- a/Documents/Test_Plan_Document.docx
+++ b/Documents/Test_Plan_Document.docx
@@ -30254,315 +30254,189 @@
             <w:vAlign w:val="center"/>
           </w:tcPr>
           <w:p>
-            <w:pPr>
-              <w:rPr/>
-            </w:pPr>
-            <w:r>
-              <w:rPr>
-                <w:b w:val="1"/>
-                <w:bCs w:val="1"/>
-                <w:color w:val="000000"/>
-                <w:sz w:val="16"/>
-                <w:szCs w:val="16"/>
-                <w:rtl w:val="0"/>
-              </w:rPr>
-              <w:t xml:space="preserve">UT_08_2</w:t>
-            </w:r>
-            <w:r>
-              <w:rPr>
-                <w:rtl w:val="0"/>
-              </w:rPr>
-            </w:r>
-          </w:p>
-        </w:tc>
-        <w:tc>
-          <w:tcPr>
-            <w:tcBorders>
-              <w:top w:color="000000" w:space="0" w:sz="4" w:val="single"/>
-              <w:left w:color="000000" w:space="0" w:sz="4" w:val="single"/>
-              <w:bottom w:color="000000" w:space="0" w:sz="4" w:val="single"/>
-              <w:right w:color="000000" w:space="0" w:sz="4" w:val="single"/>
-            </w:tcBorders>
-            <w:shd w:fill="ededed" w:val="clear"/>
-            <w:tcMar>
-              <w:top w:w="60.0" w:type="dxa"/>
-              <w:left w:w="80.0" w:type="dxa"/>
-              <w:bottom w:w="60.0" w:type="dxa"/>
-              <w:right w:w="80.0" w:type="dxa"/>
-            </w:tcMar>
-            <w:vAlign w:val="center"/>
-          </w:tcPr>
-          <w:p>
-            <w:pPr>
-              <w:rPr/>
-            </w:pPr>
-            <w:r>
-              <w:rPr>
-                <w:b w:val="0"/>
-                <w:bCs w:val="0"/>
-                <w:color w:val="000000"/>
-                <w:sz w:val="16"/>
-                <w:szCs w:val="16"/>
-                <w:rtl w:val="0"/>
-              </w:rPr>
-              <w:t xml:space="preserve">Attendance Viewing</w:t>
-            </w:r>
-            <w:r>
-              <w:rPr>
-                <w:rtl w:val="0"/>
-              </w:rPr>
-            </w:r>
-          </w:p>
-        </w:tc>
-        <w:tc>
-          <w:tcPr>
-            <w:tcBorders>
-              <w:top w:color="000000" w:space="0" w:sz="4" w:val="single"/>
-              <w:left w:color="000000" w:space="0" w:sz="4" w:val="single"/>
-              <w:bottom w:color="000000" w:space="0" w:sz="4" w:val="single"/>
-              <w:right w:color="000000" w:space="0" w:sz="4" w:val="single"/>
-            </w:tcBorders>
-            <w:shd w:fill="ededed" w:val="clear"/>
-            <w:tcMar>
-              <w:top w:w="60.0" w:type="dxa"/>
-              <w:left w:w="80.0" w:type="dxa"/>
-              <w:bottom w:w="60.0" w:type="dxa"/>
-              <w:right w:w="80.0" w:type="dxa"/>
-            </w:tcMar>
-            <w:vAlign w:val="center"/>
-          </w:tcPr>
-          <w:p>
-            <w:pPr>
-              <w:rPr/>
-            </w:pPr>
-            <w:r>
-              <w:rPr>
-                <w:b w:val="0"/>
-                <w:bCs w:val="0"/>
-                <w:color w:val="000000"/>
-                <w:sz w:val="16"/>
-                <w:szCs w:val="16"/>
-                <w:rtl w:val="0"/>
-              </w:rPr>
-              <w:t xml:space="preserve">Verify View Attendance is rejected when a required field is left blank.</w:t>
-            </w:r>
-            <w:r>
-              <w:rPr>
-                <w:rtl w:val="0"/>
-              </w:rPr>
-            </w:r>
-          </w:p>
-        </w:tc>
-        <w:tc>
-          <w:tcPr>
-            <w:tcBorders>
-              <w:top w:color="000000" w:space="0" w:sz="4" w:val="single"/>
-              <w:left w:color="000000" w:space="0" w:sz="4" w:val="single"/>
-              <w:bottom w:color="000000" w:space="0" w:sz="4" w:val="single"/>
-              <w:right w:color="000000" w:space="0" w:sz="4" w:val="single"/>
-            </w:tcBorders>
-            <w:shd w:fill="ededed" w:val="clear"/>
-            <w:tcMar>
-              <w:top w:w="60.0" w:type="dxa"/>
-              <w:left w:w="80.0" w:type="dxa"/>
-              <w:bottom w:w="60.0" w:type="dxa"/>
-              <w:right w:w="80.0" w:type="dxa"/>
-            </w:tcMar>
-            <w:vAlign w:val="center"/>
-          </w:tcPr>
-          <w:p>
-            <w:pPr>
-              <w:rPr/>
-            </w:pPr>
-            <w:r>
-              <w:rPr>
-                <w:b w:val="0"/>
-                <w:bCs w:val="0"/>
-                <w:color w:val="000000"/>
-                <w:sz w:val="16"/>
-                <w:szCs w:val="16"/>
-                <w:rtl w:val="0"/>
-              </w:rPr>
-              <w:t xml:space="preserve">User is logged in.</w:t>
-            </w:r>
-            <w:r>
-              <w:rPr>
-                <w:rtl w:val="0"/>
-              </w:rPr>
-            </w:r>
-          </w:p>
-        </w:tc>
-        <w:tc>
-          <w:tcPr>
-            <w:tcBorders>
-              <w:top w:color="000000" w:space="0" w:sz="4" w:val="single"/>
-              <w:left w:color="000000" w:space="0" w:sz="4" w:val="single"/>
-              <w:bottom w:color="000000" w:space="0" w:sz="4" w:val="single"/>
-              <w:right w:color="000000" w:space="0" w:sz="4" w:val="single"/>
-            </w:tcBorders>
-            <w:shd w:fill="ededed" w:val="clear"/>
-            <w:tcMar>
-              <w:top w:w="60.0" w:type="dxa"/>
-              <w:left w:w="80.0" w:type="dxa"/>
-              <w:bottom w:w="60.0" w:type="dxa"/>
-              <w:right w:w="80.0" w:type="dxa"/>
-            </w:tcMar>
-            <w:vAlign w:val="center"/>
-          </w:tcPr>
-          <w:p>
-            <w:pPr>
-              <w:rPr/>
-            </w:pPr>
-            <w:r>
-              <w:rPr>
-                <w:b w:val="0"/>
-                <w:bCs w:val="0"/>
-                <w:color w:val="000000"/>
-                <w:sz w:val="16"/>
-                <w:szCs w:val="16"/>
-                <w:rtl w:val="0"/>
-              </w:rPr>
-              <w:t xml:space="preserve">1: Open the relevant form. 2: Leave a mandatory field empty. 3: Attempt to submit.</w:t>
-            </w:r>
-            <w:r>
-              <w:rPr>
-                <w:rtl w:val="0"/>
-              </w:rPr>
-            </w:r>
-          </w:p>
-        </w:tc>
-        <w:tc>
-          <w:tcPr>
-            <w:tcBorders>
-              <w:top w:color="000000" w:space="0" w:sz="4" w:val="single"/>
-              <w:left w:color="000000" w:space="0" w:sz="4" w:val="single"/>
-              <w:bottom w:color="000000" w:space="0" w:sz="4" w:val="single"/>
-              <w:right w:color="000000" w:space="0" w:sz="4" w:val="single"/>
-            </w:tcBorders>
-            <w:shd w:fill="ededed" w:val="clear"/>
-            <w:tcMar>
-              <w:top w:w="60.0" w:type="dxa"/>
-              <w:left w:w="80.0" w:type="dxa"/>
-              <w:bottom w:w="60.0" w:type="dxa"/>
-              <w:right w:w="80.0" w:type="dxa"/>
-            </w:tcMar>
-            <w:vAlign w:val="center"/>
-          </w:tcPr>
-          <w:p>
-            <w:pPr>
-              <w:rPr/>
-            </w:pPr>
-            <w:r>
-              <w:rPr>
-                <w:b w:val="0"/>
-                <w:bCs w:val="0"/>
-                <w:color w:val="000000"/>
-                <w:sz w:val="16"/>
-                <w:szCs w:val="16"/>
-                <w:rtl w:val="0"/>
-              </w:rPr>
-              <w:t xml:space="preserve">One or more required fields blank; rest valid.</w:t>
-            </w:r>
-            <w:r>
-              <w:rPr>
-                <w:rtl w:val="0"/>
-              </w:rPr>
-            </w:r>
-          </w:p>
-        </w:tc>
-        <w:tc>
-          <w:tcPr>
-            <w:tcBorders>
-              <w:top w:color="000000" w:space="0" w:sz="4" w:val="single"/>
-              <w:left w:color="000000" w:space="0" w:sz="4" w:val="single"/>
-              <w:bottom w:color="000000" w:space="0" w:sz="4" w:val="single"/>
-              <w:right w:color="000000" w:space="0" w:sz="4" w:val="single"/>
-            </w:tcBorders>
-            <w:shd w:fill="ededed" w:val="clear"/>
-            <w:tcMar>
-              <w:top w:w="60.0" w:type="dxa"/>
-              <w:left w:w="80.0" w:type="dxa"/>
-              <w:bottom w:w="60.0" w:type="dxa"/>
-              <w:right w:w="80.0" w:type="dxa"/>
-            </w:tcMar>
-            <w:vAlign w:val="center"/>
-          </w:tcPr>
-          <w:p>
-            <w:pPr>
-              <w:rPr/>
-            </w:pPr>
-            <w:r>
-              <w:rPr>
-                <w:b w:val="0"/>
-                <w:bCs w:val="0"/>
-                <w:color w:val="000000"/>
-                <w:sz w:val="16"/>
-                <w:szCs w:val="16"/>
-                <w:rtl w:val="0"/>
-              </w:rPr>
-              <w:t xml:space="preserve">System blocks submission and shows a validation error on the missing field.</w:t>
-            </w:r>
-            <w:r>
-              <w:rPr>
-                <w:rtl w:val="0"/>
-              </w:rPr>
-            </w:r>
-          </w:p>
-        </w:tc>
-        <w:tc>
-          <w:tcPr>
-            <w:tcBorders>
-              <w:top w:color="000000" w:space="0" w:sz="4" w:val="single"/>
-              <w:left w:color="000000" w:space="0" w:sz="4" w:val="single"/>
-              <w:bottom w:color="000000" w:space="0" w:sz="4" w:val="single"/>
-              <w:right w:color="000000" w:space="0" w:sz="4" w:val="single"/>
-            </w:tcBorders>
-            <w:shd w:fill="ededed" w:val="clear"/>
-            <w:tcMar>
-              <w:top w:w="60.0" w:type="dxa"/>
-              <w:left w:w="80.0" w:type="dxa"/>
-              <w:bottom w:w="60.0" w:type="dxa"/>
-              <w:right w:w="80.0" w:type="dxa"/>
-            </w:tcMar>
-            <w:vAlign w:val="center"/>
-          </w:tcPr>
-          <w:p>
-            <w:pPr>
-              <w:rPr/>
-            </w:pPr>
-            <w:r>
-              <w:rPr>
-                <w:rtl w:val="0"/>
-              </w:rPr>
-            </w:r>
-          </w:p>
-        </w:tc>
-        <w:tc>
-          <w:tcPr>
-            <w:tcBorders>
-              <w:top w:color="000000" w:space="0" w:sz="4" w:val="single"/>
-              <w:left w:color="000000" w:space="0" w:sz="4" w:val="single"/>
-              <w:bottom w:color="000000" w:space="0" w:sz="4" w:val="single"/>
-              <w:right w:color="000000" w:space="0" w:sz="4" w:val="single"/>
-            </w:tcBorders>
-            <w:shd w:fill="ededed" w:val="clear"/>
-            <w:tcMar>
-              <w:top w:w="60.0" w:type="dxa"/>
-              <w:left w:w="80.0" w:type="dxa"/>
-              <w:bottom w:w="60.0" w:type="dxa"/>
-              <w:right w:w="80.0" w:type="dxa"/>
-            </w:tcMar>
-            <w:vAlign w:val="center"/>
-          </w:tcPr>
-          <w:p>
-            <w:pPr>
-              <w:rPr/>
-            </w:pPr>
-            <w:r>
-              <w:rPr>
-                <w:rtl w:val="0"/>
-              </w:rPr>
-            </w:r>
+            <w:r>
+              <w:t>UT_08_2</w:t>
+            </w:r>
+          </w:p>
+        </w:tc>
+        <w:tc>
+          <w:tcPr>
+            <w:tcBorders>
+              <w:top w:color="000000" w:space="0" w:sz="4" w:val="single"/>
+              <w:left w:color="000000" w:space="0" w:sz="4" w:val="single"/>
+              <w:bottom w:color="000000" w:space="0" w:sz="4" w:val="single"/>
+              <w:right w:color="000000" w:space="0" w:sz="4" w:val="single"/>
+            </w:tcBorders>
+            <w:shd w:fill="ededed" w:val="clear"/>
+            <w:tcMar>
+              <w:top w:w="60.0" w:type="dxa"/>
+              <w:left w:w="80.0" w:type="dxa"/>
+              <w:bottom w:w="60.0" w:type="dxa"/>
+              <w:right w:w="80.0" w:type="dxa"/>
+            </w:tcMar>
+            <w:vAlign w:val="center"/>
+          </w:tcPr>
+          <w:p>
+            <w:r>
+              <w:t>Attendance Viewing / BL-15</w:t>
+            </w:r>
+          </w:p>
+        </w:tc>
+        <w:tc>
+          <w:tcPr>
+            <w:tcBorders>
+              <w:top w:color="000000" w:space="0" w:sz="4" w:val="single"/>
+              <w:left w:color="000000" w:space="0" w:sz="4" w:val="single"/>
+              <w:bottom w:color="000000" w:space="0" w:sz="4" w:val="single"/>
+              <w:right w:color="000000" w:space="0" w:sz="4" w:val="single"/>
+            </w:tcBorders>
+            <w:shd w:fill="ededed" w:val="clear"/>
+            <w:tcMar>
+              <w:top w:w="60.0" w:type="dxa"/>
+              <w:left w:w="80.0" w:type="dxa"/>
+              <w:bottom w:w="60.0" w:type="dxa"/>
+              <w:right w:w="80.0" w:type="dxa"/>
+            </w:tcMar>
+            <w:vAlign w:val="center"/>
+          </w:tcPr>
+          <w:p>
+            <w:r>
+              <w:t>Verify subject filter returns only the selected subject.</w:t>
+            </w:r>
+          </w:p>
+        </w:tc>
+        <w:tc>
+          <w:tcPr>
+            <w:tcBorders>
+              <w:top w:color="000000" w:space="0" w:sz="4" w:val="single"/>
+              <w:left w:color="000000" w:space="0" w:sz="4" w:val="single"/>
+              <w:bottom w:color="000000" w:space="0" w:sz="4" w:val="single"/>
+              <w:right w:color="000000" w:space="0" w:sz="4" w:val="single"/>
+            </w:tcBorders>
+            <w:shd w:fill="ededed" w:val="clear"/>
+            <w:tcMar>
+              <w:top w:w="60.0" w:type="dxa"/>
+              <w:left w:w="80.0" w:type="dxa"/>
+              <w:bottom w:w="60.0" w:type="dxa"/>
+              <w:right w:w="80.0" w:type="dxa"/>
+            </w:tcMar>
+            <w:vAlign w:val="center"/>
+          </w:tcPr>
+          <w:p>
+            <w:r>
+              <w:t>Student S001 is logged in; S001 has records in CS101 and MA101.</w:t>
+            </w:r>
+          </w:p>
+        </w:tc>
+        <w:tc>
+          <w:tcPr>
+            <w:tcBorders>
+              <w:top w:color="000000" w:space="0" w:sz="4" w:val="single"/>
+              <w:left w:color="000000" w:space="0" w:sz="4" w:val="single"/>
+              <w:bottom w:color="000000" w:space="0" w:sz="4" w:val="single"/>
+              <w:right w:color="000000" w:space="0" w:sz="4" w:val="single"/>
+            </w:tcBorders>
+            <w:shd w:fill="ededed" w:val="clear"/>
+            <w:tcMar>
+              <w:top w:w="60.0" w:type="dxa"/>
+              <w:left w:w="80.0" w:type="dxa"/>
+              <w:bottom w:w="60.0" w:type="dxa"/>
+              <w:right w:w="80.0" w:type="dxa"/>
+            </w:tcMar>
+            <w:vAlign w:val="center"/>
+          </w:tcPr>
+          <w:p>
+            <w:r>
+              <w:t>1: Open My attendance. 2: Select CS101. 3: Apply the filter.</w:t>
+            </w:r>
+          </w:p>
+        </w:tc>
+        <w:tc>
+          <w:tcPr>
+            <w:tcBorders>
+              <w:top w:color="000000" w:space="0" w:sz="4" w:val="single"/>
+              <w:left w:color="000000" w:space="0" w:sz="4" w:val="single"/>
+              <w:bottom w:color="000000" w:space="0" w:sz="4" w:val="single"/>
+              <w:right w:color="000000" w:space="0" w:sz="4" w:val="single"/>
+            </w:tcBorders>
+            <w:shd w:fill="ededed" w:val="clear"/>
+            <w:tcMar>
+              <w:top w:w="60.0" w:type="dxa"/>
+              <w:left w:w="80.0" w:type="dxa"/>
+              <w:bottom w:w="60.0" w:type="dxa"/>
+              <w:right w:w="80.0" w:type="dxa"/>
+            </w:tcMar>
+            <w:vAlign w:val="center"/>
+          </w:tcPr>
+          <w:p>
+            <w:r>
+              <w:t>CS101: 2/3 Present; MA101: 1/2 Present.</w:t>
+            </w:r>
+          </w:p>
+        </w:tc>
+        <w:tc>
+          <w:tcPr>
+            <w:tcBorders>
+              <w:top w:color="000000" w:space="0" w:sz="4" w:val="single"/>
+              <w:left w:color="000000" w:space="0" w:sz="4" w:val="single"/>
+              <w:bottom w:color="000000" w:space="0" w:sz="4" w:val="single"/>
+              <w:right w:color="000000" w:space="0" w:sz="4" w:val="single"/>
+            </w:tcBorders>
+            <w:shd w:fill="ededed" w:val="clear"/>
+            <w:tcMar>
+              <w:top w:w="60.0" w:type="dxa"/>
+              <w:left w:w="80.0" w:type="dxa"/>
+              <w:bottom w:w="60.0" w:type="dxa"/>
+              <w:right w:w="80.0" w:type="dxa"/>
+            </w:tcMar>
+            <w:vAlign w:val="center"/>
+          </w:tcPr>
+          <w:p>
+            <w:r>
+              <w:t>Only CS101 appears; its counts and percentage match the calculation module. The overall total includes only the filtered subject.</w:t>
+            </w:r>
+          </w:p>
+        </w:tc>
+        <w:tc>
+          <w:tcPr>
+            <w:tcBorders>
+              <w:top w:color="000000" w:space="0" w:sz="4" w:val="single"/>
+              <w:left w:color="000000" w:space="0" w:sz="4" w:val="single"/>
+              <w:bottom w:color="000000" w:space="0" w:sz="4" w:val="single"/>
+              <w:right w:color="000000" w:space="0" w:sz="4" w:val="single"/>
+            </w:tcBorders>
+            <w:shd w:fill="ededed" w:val="clear"/>
+            <w:tcMar>
+              <w:top w:w="60.0" w:type="dxa"/>
+              <w:left w:w="80.0" w:type="dxa"/>
+              <w:bottom w:w="60.0" w:type="dxa"/>
+              <w:right w:w="80.0" w:type="dxa"/>
+            </w:tcMar>
+            <w:vAlign w:val="center"/>
+          </w:tcPr>
+          <w:p>
+            <w:r/>
+          </w:p>
+        </w:tc>
+        <w:tc>
+          <w:tcPr>
+            <w:tcBorders>
+              <w:top w:color="000000" w:space="0" w:sz="4" w:val="single"/>
+              <w:left w:color="000000" w:space="0" w:sz="4" w:val="single"/>
+              <w:bottom w:color="000000" w:space="0" w:sz="4" w:val="single"/>
+              <w:right w:color="000000" w:space="0" w:sz="4" w:val="single"/>
+            </w:tcBorders>
+            <w:shd w:fill="ededed" w:val="clear"/>
+            <w:tcMar>
+              <w:top w:w="60.0" w:type="dxa"/>
+              <w:left w:w="80.0" w:type="dxa"/>
+              <w:bottom w:w="60.0" w:type="dxa"/>
+              <w:right w:w="80.0" w:type="dxa"/>
+            </w:tcMar>
+            <w:vAlign w:val="center"/>
+          </w:tcPr>
+          <w:p>
+            <w:r/>
           </w:p>
         </w:tc>
       </w:tr>
@@ -30588,307 +30462,181 @@
             <w:vAlign w:val="center"/>
           </w:tcPr>
           <w:p>
-            <w:pPr>
-              <w:rPr/>
-            </w:pPr>
-            <w:r>
-              <w:rPr>
-                <w:b w:val="1"/>
-                <w:bCs w:val="1"/>
-                <w:color w:val="000000"/>
-                <w:sz w:val="16"/>
-                <w:szCs w:val="16"/>
-                <w:rtl w:val="0"/>
-              </w:rPr>
-              <w:t xml:space="preserve">UT_08_3</w:t>
-            </w:r>
-            <w:r>
-              <w:rPr>
-                <w:rtl w:val="0"/>
-              </w:rPr>
-            </w:r>
-          </w:p>
-        </w:tc>
-        <w:tc>
-          <w:tcPr>
-            <w:tcBorders>
-              <w:top w:color="000000" w:space="0" w:sz="4" w:val="single"/>
-              <w:left w:color="000000" w:space="0" w:sz="4" w:val="single"/>
-              <w:bottom w:color="000000" w:space="0" w:sz="4" w:val="single"/>
-              <w:right w:color="000000" w:space="0" w:sz="4" w:val="single"/>
-            </w:tcBorders>
-            <w:tcMar>
-              <w:top w:w="60.0" w:type="dxa"/>
-              <w:left w:w="80.0" w:type="dxa"/>
-              <w:bottom w:w="60.0" w:type="dxa"/>
-              <w:right w:w="80.0" w:type="dxa"/>
-            </w:tcMar>
-            <w:vAlign w:val="center"/>
-          </w:tcPr>
-          <w:p>
-            <w:pPr>
-              <w:rPr/>
-            </w:pPr>
-            <w:r>
-              <w:rPr>
-                <w:b w:val="0"/>
-                <w:bCs w:val="0"/>
-                <w:color w:val="000000"/>
-                <w:sz w:val="16"/>
-                <w:szCs w:val="16"/>
-                <w:rtl w:val="0"/>
-              </w:rPr>
-              <w:t xml:space="preserve">Attendance Viewing</w:t>
-            </w:r>
-            <w:r>
-              <w:rPr>
-                <w:rtl w:val="0"/>
-              </w:rPr>
-            </w:r>
-          </w:p>
-        </w:tc>
-        <w:tc>
-          <w:tcPr>
-            <w:tcBorders>
-              <w:top w:color="000000" w:space="0" w:sz="4" w:val="single"/>
-              <w:left w:color="000000" w:space="0" w:sz="4" w:val="single"/>
-              <w:bottom w:color="000000" w:space="0" w:sz="4" w:val="single"/>
-              <w:right w:color="000000" w:space="0" w:sz="4" w:val="single"/>
-            </w:tcBorders>
-            <w:tcMar>
-              <w:top w:w="60.0" w:type="dxa"/>
-              <w:left w:w="80.0" w:type="dxa"/>
-              <w:bottom w:w="60.0" w:type="dxa"/>
-              <w:right w:w="80.0" w:type="dxa"/>
-            </w:tcMar>
-            <w:vAlign w:val="center"/>
-          </w:tcPr>
-          <w:p>
-            <w:pPr>
-              <w:rPr/>
-            </w:pPr>
-            <w:r>
-              <w:rPr>
-                <w:b w:val="0"/>
-                <w:bCs w:val="0"/>
-                <w:color w:val="000000"/>
-                <w:sz w:val="16"/>
-                <w:szCs w:val="16"/>
-                <w:rtl w:val="0"/>
-              </w:rPr>
-              <w:t xml:space="preserve">Verify View Attendance handles invalid/out-of-range input correctly.</w:t>
-            </w:r>
-            <w:r>
-              <w:rPr>
-                <w:rtl w:val="0"/>
-              </w:rPr>
-            </w:r>
-          </w:p>
-        </w:tc>
-        <w:tc>
-          <w:tcPr>
-            <w:tcBorders>
-              <w:top w:color="000000" w:space="0" w:sz="4" w:val="single"/>
-              <w:left w:color="000000" w:space="0" w:sz="4" w:val="single"/>
-              <w:bottom w:color="000000" w:space="0" w:sz="4" w:val="single"/>
-              <w:right w:color="000000" w:space="0" w:sz="4" w:val="single"/>
-            </w:tcBorders>
-            <w:tcMar>
-              <w:top w:w="60.0" w:type="dxa"/>
-              <w:left w:w="80.0" w:type="dxa"/>
-              <w:bottom w:w="60.0" w:type="dxa"/>
-              <w:right w:w="80.0" w:type="dxa"/>
-            </w:tcMar>
-            <w:vAlign w:val="center"/>
-          </w:tcPr>
-          <w:p>
-            <w:pPr>
-              <w:rPr/>
-            </w:pPr>
-            <w:r>
-              <w:rPr>
-                <w:b w:val="0"/>
-                <w:bCs w:val="0"/>
-                <w:color w:val="000000"/>
-                <w:sz w:val="16"/>
-                <w:szCs w:val="16"/>
-                <w:rtl w:val="0"/>
-              </w:rPr>
-              <w:t xml:space="preserve">User is logged in.</w:t>
-            </w:r>
-            <w:r>
-              <w:rPr>
-                <w:rtl w:val="0"/>
-              </w:rPr>
-            </w:r>
-          </w:p>
-        </w:tc>
-        <w:tc>
-          <w:tcPr>
-            <w:tcBorders>
-              <w:top w:color="000000" w:space="0" w:sz="4" w:val="single"/>
-              <w:left w:color="000000" w:space="0" w:sz="4" w:val="single"/>
-              <w:bottom w:color="000000" w:space="0" w:sz="4" w:val="single"/>
-              <w:right w:color="000000" w:space="0" w:sz="4" w:val="single"/>
-            </w:tcBorders>
-            <w:tcMar>
-              <w:top w:w="60.0" w:type="dxa"/>
-              <w:left w:w="80.0" w:type="dxa"/>
-              <w:bottom w:w="60.0" w:type="dxa"/>
-              <w:right w:w="80.0" w:type="dxa"/>
-            </w:tcMar>
-            <w:vAlign w:val="center"/>
-          </w:tcPr>
-          <w:p>
-            <w:pPr>
-              <w:rPr/>
-            </w:pPr>
-            <w:r>
-              <w:rPr>
-                <w:b w:val="0"/>
-                <w:bCs w:val="0"/>
-                <w:color w:val="000000"/>
-                <w:sz w:val="16"/>
-                <w:szCs w:val="16"/>
-                <w:rtl w:val="0"/>
-              </w:rPr>
-              <w:t xml:space="preserve">1: Open the relevant form. 2: Enter invalid or out-of-range data (e.g. wrong format, negative value, duplicate key). 3: Attempt to submit.</w:t>
-            </w:r>
-            <w:r>
-              <w:rPr>
-                <w:rtl w:val="0"/>
-              </w:rPr>
-            </w:r>
-          </w:p>
-        </w:tc>
-        <w:tc>
-          <w:tcPr>
-            <w:tcBorders>
-              <w:top w:color="000000" w:space="0" w:sz="4" w:val="single"/>
-              <w:left w:color="000000" w:space="0" w:sz="4" w:val="single"/>
-              <w:bottom w:color="000000" w:space="0" w:sz="4" w:val="single"/>
-              <w:right w:color="000000" w:space="0" w:sz="4" w:val="single"/>
-            </w:tcBorders>
-            <w:tcMar>
-              <w:top w:w="60.0" w:type="dxa"/>
-              <w:left w:w="80.0" w:type="dxa"/>
-              <w:bottom w:w="60.0" w:type="dxa"/>
-              <w:right w:w="80.0" w:type="dxa"/>
-            </w:tcMar>
-            <w:vAlign w:val="center"/>
-          </w:tcPr>
-          <w:p>
-            <w:pPr>
-              <w:rPr/>
-            </w:pPr>
-            <w:r>
-              <w:rPr>
-                <w:b w:val="0"/>
-                <w:bCs w:val="0"/>
-                <w:color w:val="000000"/>
-                <w:sz w:val="16"/>
-                <w:szCs w:val="16"/>
-                <w:rtl w:val="0"/>
-              </w:rPr>
-              <w:t xml:space="preserve">Deliberately invalid input, e.g. duplicate ID, malformed date, or text in a numeric field.</w:t>
-            </w:r>
-            <w:r>
-              <w:rPr>
-                <w:rtl w:val="0"/>
-              </w:rPr>
-            </w:r>
-          </w:p>
-        </w:tc>
-        <w:tc>
-          <w:tcPr>
-            <w:tcBorders>
-              <w:top w:color="000000" w:space="0" w:sz="4" w:val="single"/>
-              <w:left w:color="000000" w:space="0" w:sz="4" w:val="single"/>
-              <w:bottom w:color="000000" w:space="0" w:sz="4" w:val="single"/>
-              <w:right w:color="000000" w:space="0" w:sz="4" w:val="single"/>
-            </w:tcBorders>
-            <w:tcMar>
-              <w:top w:w="60.0" w:type="dxa"/>
-              <w:left w:w="80.0" w:type="dxa"/>
-              <w:bottom w:w="60.0" w:type="dxa"/>
-              <w:right w:w="80.0" w:type="dxa"/>
-            </w:tcMar>
-            <w:vAlign w:val="center"/>
-          </w:tcPr>
-          <w:p>
-            <w:pPr>
-              <w:rPr/>
-            </w:pPr>
-            <w:r>
-              <w:rPr>
-                <w:b w:val="0"/>
-                <w:bCs w:val="0"/>
-                <w:color w:val="000000"/>
-                <w:sz w:val="16"/>
-                <w:szCs w:val="16"/>
-                <w:rtl w:val="0"/>
-              </w:rPr>
-              <w:t xml:space="preserve">System rejects the input and displays a clear, specific error message.</w:t>
-            </w:r>
-            <w:r>
-              <w:rPr>
-                <w:rtl w:val="0"/>
-              </w:rPr>
-            </w:r>
-          </w:p>
-        </w:tc>
-        <w:tc>
-          <w:tcPr>
-            <w:tcBorders>
-              <w:top w:color="000000" w:space="0" w:sz="4" w:val="single"/>
-              <w:left w:color="000000" w:space="0" w:sz="4" w:val="single"/>
-              <w:bottom w:color="000000" w:space="0" w:sz="4" w:val="single"/>
-              <w:right w:color="000000" w:space="0" w:sz="4" w:val="single"/>
-            </w:tcBorders>
-            <w:tcMar>
-              <w:top w:w="60.0" w:type="dxa"/>
-              <w:left w:w="80.0" w:type="dxa"/>
-              <w:bottom w:w="60.0" w:type="dxa"/>
-              <w:right w:w="80.0" w:type="dxa"/>
-            </w:tcMar>
-            <w:vAlign w:val="center"/>
-          </w:tcPr>
-          <w:p>
-            <w:pPr>
-              <w:rPr/>
-            </w:pPr>
-            <w:r>
-              <w:rPr>
-                <w:rtl w:val="0"/>
-              </w:rPr>
-            </w:r>
-          </w:p>
-        </w:tc>
-        <w:tc>
-          <w:tcPr>
-            <w:tcBorders>
-              <w:top w:color="000000" w:space="0" w:sz="4" w:val="single"/>
-              <w:left w:color="000000" w:space="0" w:sz="4" w:val="single"/>
-              <w:bottom w:color="000000" w:space="0" w:sz="4" w:val="single"/>
-              <w:right w:color="000000" w:space="0" w:sz="4" w:val="single"/>
-            </w:tcBorders>
-            <w:tcMar>
-              <w:top w:w="60.0" w:type="dxa"/>
-              <w:left w:w="80.0" w:type="dxa"/>
-              <w:bottom w:w="60.0" w:type="dxa"/>
-              <w:right w:w="80.0" w:type="dxa"/>
-            </w:tcMar>
-            <w:vAlign w:val="center"/>
-          </w:tcPr>
-          <w:p>
-            <w:pPr>
-              <w:rPr/>
-            </w:pPr>
-            <w:r>
-              <w:rPr>
-                <w:rtl w:val="0"/>
-              </w:rPr>
-            </w:r>
+            <w:r>
+              <w:t>UT_08_3</w:t>
+            </w:r>
+          </w:p>
+        </w:tc>
+        <w:tc>
+          <w:tcPr>
+            <w:tcBorders>
+              <w:top w:color="000000" w:space="0" w:sz="4" w:val="single"/>
+              <w:left w:color="000000" w:space="0" w:sz="4" w:val="single"/>
+              <w:bottom w:color="000000" w:space="0" w:sz="4" w:val="single"/>
+              <w:right w:color="000000" w:space="0" w:sz="4" w:val="single"/>
+            </w:tcBorders>
+            <w:tcMar>
+              <w:top w:w="60.0" w:type="dxa"/>
+              <w:left w:w="80.0" w:type="dxa"/>
+              <w:bottom w:w="60.0" w:type="dxa"/>
+              <w:right w:w="80.0" w:type="dxa"/>
+            </w:tcMar>
+            <w:vAlign w:val="center"/>
+          </w:tcPr>
+          <w:p>
+            <w:r>
+              <w:t>Attendance Viewing / BL-15</w:t>
+            </w:r>
+          </w:p>
+        </w:tc>
+        <w:tc>
+          <w:tcPr>
+            <w:tcBorders>
+              <w:top w:color="000000" w:space="0" w:sz="4" w:val="single"/>
+              <w:left w:color="000000" w:space="0" w:sz="4" w:val="single"/>
+              <w:bottom w:color="000000" w:space="0" w:sz="4" w:val="single"/>
+              <w:right w:color="000000" w:space="0" w:sz="4" w:val="single"/>
+            </w:tcBorders>
+            <w:tcMar>
+              <w:top w:w="60.0" w:type="dxa"/>
+              <w:left w:w="80.0" w:type="dxa"/>
+              <w:bottom w:w="60.0" w:type="dxa"/>
+              <w:right w:w="80.0" w:type="dxa"/>
+            </w:tcMar>
+            <w:vAlign w:val="center"/>
+          </w:tcPr>
+          <w:p>
+            <w:r>
+              <w:t>Verify inclusive date filters and invalid date-range handling.</w:t>
+            </w:r>
+          </w:p>
+        </w:tc>
+        <w:tc>
+          <w:tcPr>
+            <w:tcBorders>
+              <w:top w:color="000000" w:space="0" w:sz="4" w:val="single"/>
+              <w:left w:color="000000" w:space="0" w:sz="4" w:val="single"/>
+              <w:bottom w:color="000000" w:space="0" w:sz="4" w:val="single"/>
+              <w:right w:color="000000" w:space="0" w:sz="4" w:val="single"/>
+            </w:tcBorders>
+            <w:tcMar>
+              <w:top w:w="60.0" w:type="dxa"/>
+              <w:left w:w="80.0" w:type="dxa"/>
+              <w:bottom w:w="60.0" w:type="dxa"/>
+              <w:right w:w="80.0" w:type="dxa"/>
+            </w:tcMar>
+            <w:vAlign w:val="center"/>
+          </w:tcPr>
+          <w:p>
+            <w:r>
+              <w:t>Student S001 is logged in and has CS101 attendance on 1, 2, and 3 Oct 2026.</w:t>
+            </w:r>
+          </w:p>
+        </w:tc>
+        <w:tc>
+          <w:tcPr>
+            <w:tcBorders>
+              <w:top w:color="000000" w:space="0" w:sz="4" w:val="single"/>
+              <w:left w:color="000000" w:space="0" w:sz="4" w:val="single"/>
+              <w:bottom w:color="000000" w:space="0" w:sz="4" w:val="single"/>
+              <w:right w:color="000000" w:space="0" w:sz="4" w:val="single"/>
+            </w:tcBorders>
+            <w:tcMar>
+              <w:top w:w="60.0" w:type="dxa"/>
+              <w:left w:w="80.0" w:type="dxa"/>
+              <w:bottom w:w="60.0" w:type="dxa"/>
+              <w:right w:w="80.0" w:type="dxa"/>
+            </w:tcMar>
+            <w:vAlign w:val="center"/>
+          </w:tcPr>
+          <w:p>
+            <w:r>
+              <w:t>1: Filter from 2 Oct through 3 Oct. 2: Verify matching totals. 3: Reverse the date range and submit.</w:t>
+            </w:r>
+          </w:p>
+        </w:tc>
+        <w:tc>
+          <w:tcPr>
+            <w:tcBorders>
+              <w:top w:color="000000" w:space="0" w:sz="4" w:val="single"/>
+              <w:left w:color="000000" w:space="0" w:sz="4" w:val="single"/>
+              <w:bottom w:color="000000" w:space="0" w:sz="4" w:val="single"/>
+              <w:right w:color="000000" w:space="0" w:sz="4" w:val="single"/>
+            </w:tcBorders>
+            <w:tcMar>
+              <w:top w:w="60.0" w:type="dxa"/>
+              <w:left w:w="80.0" w:type="dxa"/>
+              <w:bottom w:w="60.0" w:type="dxa"/>
+              <w:right w:w="80.0" w:type="dxa"/>
+            </w:tcMar>
+            <w:vAlign w:val="center"/>
+          </w:tcPr>
+          <w:p>
+            <w:r>
+              <w:t>2 Oct: Present; 3 Oct: Absent; range 2–3 Oct.</w:t>
+            </w:r>
+          </w:p>
+        </w:tc>
+        <w:tc>
+          <w:tcPr>
+            <w:tcBorders>
+              <w:top w:color="000000" w:space="0" w:sz="4" w:val="single"/>
+              <w:left w:color="000000" w:space="0" w:sz="4" w:val="single"/>
+              <w:bottom w:color="000000" w:space="0" w:sz="4" w:val="single"/>
+              <w:right w:color="000000" w:space="0" w:sz="4" w:val="single"/>
+            </w:tcBorders>
+            <w:tcMar>
+              <w:top w:w="60.0" w:type="dxa"/>
+              <w:left w:w="80.0" w:type="dxa"/>
+              <w:bottom w:w="60.0" w:type="dxa"/>
+              <w:right w:w="80.0" w:type="dxa"/>
+            </w:tcMar>
+            <w:vAlign w:val="center"/>
+          </w:tcPr>
+          <w:p>
+            <w:r>
+              <w:t>Valid range includes both boundary dates and excludes 1 Oct. Reversed range displays a validation error and does not show misleading totals.</w:t>
+            </w:r>
+          </w:p>
+        </w:tc>
+        <w:tc>
+          <w:tcPr>
+            <w:tcBorders>
+              <w:top w:color="000000" w:space="0" w:sz="4" w:val="single"/>
+              <w:left w:color="000000" w:space="0" w:sz="4" w:val="single"/>
+              <w:bottom w:color="000000" w:space="0" w:sz="4" w:val="single"/>
+              <w:right w:color="000000" w:space="0" w:sz="4" w:val="single"/>
+            </w:tcBorders>
+            <w:tcMar>
+              <w:top w:w="60.0" w:type="dxa"/>
+              <w:left w:w="80.0" w:type="dxa"/>
+              <w:bottom w:w="60.0" w:type="dxa"/>
+              <w:right w:w="80.0" w:type="dxa"/>
+            </w:tcMar>
+            <w:vAlign w:val="center"/>
+          </w:tcPr>
+          <w:p>
+            <w:r/>
+          </w:p>
+        </w:tc>
+        <w:tc>
+          <w:tcPr>
+            <w:tcBorders>
+              <w:top w:color="000000" w:space="0" w:sz="4" w:val="single"/>
+              <w:left w:color="000000" w:space="0" w:sz="4" w:val="single"/>
+              <w:bottom w:color="000000" w:space="0" w:sz="4" w:val="single"/>
+              <w:right w:color="000000" w:space="0" w:sz="4" w:val="single"/>
+            </w:tcBorders>
+            <w:tcMar>
+              <w:top w:w="60.0" w:type="dxa"/>
+              <w:left w:w="80.0" w:type="dxa"/>
+              <w:bottom w:w="60.0" w:type="dxa"/>
+              <w:right w:w="80.0" w:type="dxa"/>
+            </w:tcMar>
+            <w:vAlign w:val="center"/>
+          </w:tcPr>
+          <w:p>
+            <w:r/>
           </w:p>
         </w:tc>
       </w:tr>
@@ -34194,6 +33942,182 @@
                 <w:rtl w:val="0"/>
               </w:rPr>
             </w:r>
+          </w:p>
+        </w:tc>
+      </w:tr>
+      <w:tr>
+        <w:tc>
+          <w:tcPr>
+            <w:tcW w:type="dxa" w:w="750"/>
+          </w:tcPr>
+          <w:p>
+            <w:r>
+              <w:t>IT_08_5</w:t>
+            </w:r>
+          </w:p>
+        </w:tc>
+        <w:tc>
+          <w:tcPr>
+            <w:tcW w:type="dxa" w:w="1000"/>
+          </w:tcPr>
+          <w:p>
+            <w:r>
+              <w:t>Attendance Viewing / BL-15 / SEC-12</w:t>
+            </w:r>
+          </w:p>
+        </w:tc>
+        <w:tc>
+          <w:tcPr>
+            <w:tcW w:type="dxa" w:w="1750"/>
+          </w:tcPr>
+          <w:p>
+            <w:r>
+              <w:t>Verify query parameters cannot expose another student's report.</w:t>
+            </w:r>
+          </w:p>
+        </w:tc>
+        <w:tc>
+          <w:tcPr>
+            <w:tcW w:type="dxa" w:w="1300"/>
+          </w:tcPr>
+          <w:p>
+            <w:r>
+              <w:t>Students S001 and S002 exist; S001 is logged in.</w:t>
+            </w:r>
+          </w:p>
+        </w:tc>
+        <w:tc>
+          <w:tcPr>
+            <w:tcW w:type="dxa" w:w="2400"/>
+          </w:tcPr>
+          <w:p>
+            <w:r>
+              <w:t>1: Request /attendance/mine/?student=&lt;S002 id&gt;. 2: Inspect identity and attendance shown.</w:t>
+            </w:r>
+          </w:p>
+        </w:tc>
+        <w:tc>
+          <w:tcPr>
+            <w:tcW w:type="dxa" w:w="1300"/>
+          </w:tcPr>
+          <w:p>
+            <w:r>
+              <w:t>URL contains S002's numeric ID; S001 has 1/2 Present; S002 has 2/2 Present.</w:t>
+            </w:r>
+          </w:p>
+        </w:tc>
+        <w:tc>
+          <w:tcPr>
+            <w:tcW w:type="dxa" w:w="1650"/>
+          </w:tcPr>
+          <w:p>
+            <w:r>
+              <w:t>Only S001's own report is shown; S002's identity and totals are not disclosed.</w:t>
+            </w:r>
+          </w:p>
+        </w:tc>
+        <w:tc>
+          <w:tcPr>
+            <w:tcW w:type="dxa" w:w="750"/>
+          </w:tcPr>
+          <w:p>
+            <w:r/>
+          </w:p>
+        </w:tc>
+        <w:tc>
+          <w:tcPr>
+            <w:tcW w:type="dxa" w:w="650"/>
+          </w:tcPr>
+          <w:p>
+            <w:r/>
+          </w:p>
+        </w:tc>
+      </w:tr>
+      <w:tr>
+        <w:tc>
+          <w:tcPr>
+            <w:tcW w:type="dxa" w:w="750"/>
+          </w:tcPr>
+          <w:p>
+            <w:r>
+              <w:t>ST_08_1</w:t>
+            </w:r>
+          </w:p>
+        </w:tc>
+        <w:tc>
+          <w:tcPr>
+            <w:tcW w:type="dxa" w:w="1000"/>
+          </w:tcPr>
+          <w:p>
+            <w:r>
+              <w:t>Attendance Viewing / BL-15</w:t>
+            </w:r>
+          </w:p>
+        </w:tc>
+        <w:tc>
+          <w:tcPr>
+            <w:tcW w:type="dxa" w:w="1750"/>
+          </w:tcPr>
+          <w:p>
+            <w:r>
+              <w:t>Verify no matching attendance has a clear empty state.</w:t>
+            </w:r>
+          </w:p>
+        </w:tc>
+        <w:tc>
+          <w:tcPr>
+            <w:tcW w:type="dxa" w:w="1300"/>
+          </w:tcPr>
+          <w:p>
+            <w:r>
+              <w:t>Student S001 is logged in with saved attendance outside the chosen date range.</w:t>
+            </w:r>
+          </w:p>
+        </w:tc>
+        <w:tc>
+          <w:tcPr>
+            <w:tcW w:type="dxa" w:w="2400"/>
+          </w:tcPr>
+          <w:p>
+            <w:r>
+              <w:t>1: Select a date range with no saved records. 2: Apply filters.</w:t>
+            </w:r>
+          </w:p>
+        </w:tc>
+        <w:tc>
+          <w:tcPr>
+            <w:tcW w:type="dxa" w:w="1300"/>
+          </w:tcPr>
+          <w:p>
+            <w:r>
+              <w:t>From 10 Oct 2026 through 11 Oct 2026; no records in this period.</w:t>
+            </w:r>
+          </w:p>
+        </w:tc>
+        <w:tc>
+          <w:tcPr>
+            <w:tcW w:type="dxa" w:w="1650"/>
+          </w:tcPr>
+          <w:p>
+            <w:r>
+              <w:t>Subject table displays 'No attendance records match these filters.' and overall displays N/A — no classes yet.</w:t>
+            </w:r>
+          </w:p>
+        </w:tc>
+        <w:tc>
+          <w:tcPr>
+            <w:tcW w:type="dxa" w:w="750"/>
+          </w:tcPr>
+          <w:p>
+            <w:r/>
+          </w:p>
+        </w:tc>
+        <w:tc>
+          <w:tcPr>
+            <w:tcW w:type="dxa" w:w="650"/>
+          </w:tcPr>
+          <w:p>
+            <w:r/>
           </w:p>
         </w:tc>
       </w:tr>
@@ -38034,315 +37958,189 @@
             <w:vAlign w:val="center"/>
           </w:tcPr>
           <w:p>
-            <w:pPr>
-              <w:rPr/>
-            </w:pPr>
-            <w:r>
-              <w:rPr>
-                <w:b w:val="1"/>
-                <w:bCs w:val="1"/>
-                <w:color w:val="000000"/>
-                <w:sz w:val="16"/>
-                <w:szCs w:val="16"/>
-                <w:rtl w:val="0"/>
-              </w:rPr>
-              <w:t xml:space="preserve">UT_10_2</w:t>
-            </w:r>
-            <w:r>
-              <w:rPr>
-                <w:rtl w:val="0"/>
-              </w:rPr>
-            </w:r>
-          </w:p>
-        </w:tc>
-        <w:tc>
-          <w:tcPr>
-            <w:tcBorders>
-              <w:top w:color="000000" w:space="0" w:sz="4" w:val="single"/>
-              <w:left w:color="000000" w:space="0" w:sz="4" w:val="single"/>
-              <w:bottom w:color="000000" w:space="0" w:sz="4" w:val="single"/>
-              <w:right w:color="000000" w:space="0" w:sz="4" w:val="single"/>
-            </w:tcBorders>
-            <w:shd w:fill="ededed" w:val="clear"/>
-            <w:tcMar>
-              <w:top w:w="60.0" w:type="dxa"/>
-              <w:left w:w="80.0" w:type="dxa"/>
-              <w:bottom w:w="60.0" w:type="dxa"/>
-              <w:right w:w="80.0" w:type="dxa"/>
-            </w:tcMar>
-            <w:vAlign w:val="center"/>
-          </w:tcPr>
-          <w:p>
-            <w:pPr>
-              <w:rPr/>
-            </w:pPr>
-            <w:r>
-              <w:rPr>
-                <w:b w:val="0"/>
-                <w:bCs w:val="0"/>
-                <w:color w:val="000000"/>
-                <w:sz w:val="16"/>
-                <w:szCs w:val="16"/>
-                <w:rtl w:val="0"/>
-              </w:rPr>
-              <w:t xml:space="preserve">Attendance Monitoring</w:t>
-            </w:r>
-            <w:r>
-              <w:rPr>
-                <w:rtl w:val="0"/>
-              </w:rPr>
-            </w:r>
-          </w:p>
-        </w:tc>
-        <w:tc>
-          <w:tcPr>
-            <w:tcBorders>
-              <w:top w:color="000000" w:space="0" w:sz="4" w:val="single"/>
-              <w:left w:color="000000" w:space="0" w:sz="4" w:val="single"/>
-              <w:bottom w:color="000000" w:space="0" w:sz="4" w:val="single"/>
-              <w:right w:color="000000" w:space="0" w:sz="4" w:val="single"/>
-            </w:tcBorders>
-            <w:shd w:fill="ededed" w:val="clear"/>
-            <w:tcMar>
-              <w:top w:w="60.0" w:type="dxa"/>
-              <w:left w:w="80.0" w:type="dxa"/>
-              <w:bottom w:w="60.0" w:type="dxa"/>
-              <w:right w:w="80.0" w:type="dxa"/>
-            </w:tcMar>
-            <w:vAlign w:val="center"/>
-          </w:tcPr>
-          <w:p>
-            <w:pPr>
-              <w:rPr/>
-            </w:pPr>
-            <w:r>
-              <w:rPr>
-                <w:b w:val="0"/>
-                <w:bCs w:val="0"/>
-                <w:color w:val="000000"/>
-                <w:sz w:val="16"/>
-                <w:szCs w:val="16"/>
-                <w:rtl w:val="0"/>
-              </w:rPr>
-              <w:t xml:space="preserve">Verify Low Attendance Detection &amp; Notification is rejected when a required field is left blank.</w:t>
-            </w:r>
-            <w:r>
-              <w:rPr>
-                <w:rtl w:val="0"/>
-              </w:rPr>
-            </w:r>
-          </w:p>
-        </w:tc>
-        <w:tc>
-          <w:tcPr>
-            <w:tcBorders>
-              <w:top w:color="000000" w:space="0" w:sz="4" w:val="single"/>
-              <w:left w:color="000000" w:space="0" w:sz="4" w:val="single"/>
-              <w:bottom w:color="000000" w:space="0" w:sz="4" w:val="single"/>
-              <w:right w:color="000000" w:space="0" w:sz="4" w:val="single"/>
-            </w:tcBorders>
-            <w:shd w:fill="ededed" w:val="clear"/>
-            <w:tcMar>
-              <w:top w:w="60.0" w:type="dxa"/>
-              <w:left w:w="80.0" w:type="dxa"/>
-              <w:bottom w:w="60.0" w:type="dxa"/>
-              <w:right w:w="80.0" w:type="dxa"/>
-            </w:tcMar>
-            <w:vAlign w:val="center"/>
-          </w:tcPr>
-          <w:p>
-            <w:pPr>
-              <w:rPr/>
-            </w:pPr>
-            <w:r>
-              <w:rPr>
-                <w:b w:val="0"/>
-                <w:bCs w:val="0"/>
-                <w:color w:val="000000"/>
-                <w:sz w:val="16"/>
-                <w:szCs w:val="16"/>
-                <w:rtl w:val="0"/>
-              </w:rPr>
-              <w:t xml:space="preserve">Attendance threshold is configured by the Admin (default 75%).</w:t>
-            </w:r>
-            <w:r>
-              <w:rPr>
-                <w:rtl w:val="0"/>
-              </w:rPr>
-            </w:r>
-          </w:p>
-        </w:tc>
-        <w:tc>
-          <w:tcPr>
-            <w:tcBorders>
-              <w:top w:color="000000" w:space="0" w:sz="4" w:val="single"/>
-              <w:left w:color="000000" w:space="0" w:sz="4" w:val="single"/>
-              <w:bottom w:color="000000" w:space="0" w:sz="4" w:val="single"/>
-              <w:right w:color="000000" w:space="0" w:sz="4" w:val="single"/>
-            </w:tcBorders>
-            <w:shd w:fill="ededed" w:val="clear"/>
-            <w:tcMar>
-              <w:top w:w="60.0" w:type="dxa"/>
-              <w:left w:w="80.0" w:type="dxa"/>
-              <w:bottom w:w="60.0" w:type="dxa"/>
-              <w:right w:w="80.0" w:type="dxa"/>
-            </w:tcMar>
-            <w:vAlign w:val="center"/>
-          </w:tcPr>
-          <w:p>
-            <w:pPr>
-              <w:rPr/>
-            </w:pPr>
-            <w:r>
-              <w:rPr>
-                <w:b w:val="0"/>
-                <w:bCs w:val="0"/>
-                <w:color w:val="000000"/>
-                <w:sz w:val="16"/>
-                <w:szCs w:val="16"/>
-                <w:rtl w:val="0"/>
-              </w:rPr>
-              <w:t xml:space="preserve">1: Open the relevant form. 2: Leave a mandatory field empty. 3: Attempt to submit.</w:t>
-            </w:r>
-            <w:r>
-              <w:rPr>
-                <w:rtl w:val="0"/>
-              </w:rPr>
-            </w:r>
-          </w:p>
-        </w:tc>
-        <w:tc>
-          <w:tcPr>
-            <w:tcBorders>
-              <w:top w:color="000000" w:space="0" w:sz="4" w:val="single"/>
-              <w:left w:color="000000" w:space="0" w:sz="4" w:val="single"/>
-              <w:bottom w:color="000000" w:space="0" w:sz="4" w:val="single"/>
-              <w:right w:color="000000" w:space="0" w:sz="4" w:val="single"/>
-            </w:tcBorders>
-            <w:shd w:fill="ededed" w:val="clear"/>
-            <w:tcMar>
-              <w:top w:w="60.0" w:type="dxa"/>
-              <w:left w:w="80.0" w:type="dxa"/>
-              <w:bottom w:w="60.0" w:type="dxa"/>
-              <w:right w:w="80.0" w:type="dxa"/>
-            </w:tcMar>
-            <w:vAlign w:val="center"/>
-          </w:tcPr>
-          <w:p>
-            <w:pPr>
-              <w:rPr/>
-            </w:pPr>
-            <w:r>
-              <w:rPr>
-                <w:b w:val="0"/>
-                <w:bCs w:val="0"/>
-                <w:color w:val="000000"/>
-                <w:sz w:val="16"/>
-                <w:szCs w:val="16"/>
-                <w:rtl w:val="0"/>
-              </w:rPr>
-              <w:t xml:space="preserve">One or more required fields blank; rest valid.</w:t>
-            </w:r>
-            <w:r>
-              <w:rPr>
-                <w:rtl w:val="0"/>
-              </w:rPr>
-            </w:r>
-          </w:p>
-        </w:tc>
-        <w:tc>
-          <w:tcPr>
-            <w:tcBorders>
-              <w:top w:color="000000" w:space="0" w:sz="4" w:val="single"/>
-              <w:left w:color="000000" w:space="0" w:sz="4" w:val="single"/>
-              <w:bottom w:color="000000" w:space="0" w:sz="4" w:val="single"/>
-              <w:right w:color="000000" w:space="0" w:sz="4" w:val="single"/>
-            </w:tcBorders>
-            <w:shd w:fill="ededed" w:val="clear"/>
-            <w:tcMar>
-              <w:top w:w="60.0" w:type="dxa"/>
-              <w:left w:w="80.0" w:type="dxa"/>
-              <w:bottom w:w="60.0" w:type="dxa"/>
-              <w:right w:w="80.0" w:type="dxa"/>
-            </w:tcMar>
-            <w:vAlign w:val="center"/>
-          </w:tcPr>
-          <w:p>
-            <w:pPr>
-              <w:rPr/>
-            </w:pPr>
-            <w:r>
-              <w:rPr>
-                <w:b w:val="0"/>
-                <w:bCs w:val="0"/>
-                <w:color w:val="000000"/>
-                <w:sz w:val="16"/>
-                <w:szCs w:val="16"/>
-                <w:rtl w:val="0"/>
-              </w:rPr>
-              <w:t xml:space="preserve">System blocks submission and shows a validation error on the missing field.</w:t>
-            </w:r>
-            <w:r>
-              <w:rPr>
-                <w:rtl w:val="0"/>
-              </w:rPr>
-            </w:r>
-          </w:p>
-        </w:tc>
-        <w:tc>
-          <w:tcPr>
-            <w:tcBorders>
-              <w:top w:color="000000" w:space="0" w:sz="4" w:val="single"/>
-              <w:left w:color="000000" w:space="0" w:sz="4" w:val="single"/>
-              <w:bottom w:color="000000" w:space="0" w:sz="4" w:val="single"/>
-              <w:right w:color="000000" w:space="0" w:sz="4" w:val="single"/>
-            </w:tcBorders>
-            <w:shd w:fill="ededed" w:val="clear"/>
-            <w:tcMar>
-              <w:top w:w="60.0" w:type="dxa"/>
-              <w:left w:w="80.0" w:type="dxa"/>
-              <w:bottom w:w="60.0" w:type="dxa"/>
-              <w:right w:w="80.0" w:type="dxa"/>
-            </w:tcMar>
-            <w:vAlign w:val="center"/>
-          </w:tcPr>
-          <w:p>
-            <w:pPr>
-              <w:rPr/>
-            </w:pPr>
-            <w:r>
-              <w:rPr>
-                <w:rtl w:val="0"/>
-              </w:rPr>
-            </w:r>
-          </w:p>
-        </w:tc>
-        <w:tc>
-          <w:tcPr>
-            <w:tcBorders>
-              <w:top w:color="000000" w:space="0" w:sz="4" w:val="single"/>
-              <w:left w:color="000000" w:space="0" w:sz="4" w:val="single"/>
-              <w:bottom w:color="000000" w:space="0" w:sz="4" w:val="single"/>
-              <w:right w:color="000000" w:space="0" w:sz="4" w:val="single"/>
-            </w:tcBorders>
-            <w:shd w:fill="ededed" w:val="clear"/>
-            <w:tcMar>
-              <w:top w:w="60.0" w:type="dxa"/>
-              <w:left w:w="80.0" w:type="dxa"/>
-              <w:bottom w:w="60.0" w:type="dxa"/>
-              <w:right w:w="80.0" w:type="dxa"/>
-            </w:tcMar>
-            <w:vAlign w:val="center"/>
-          </w:tcPr>
-          <w:p>
-            <w:pPr>
-              <w:rPr/>
-            </w:pPr>
-            <w:r>
-              <w:rPr>
-                <w:rtl w:val="0"/>
-              </w:rPr>
-            </w:r>
+            <w:r>
+              <w:t>UT_10_2</w:t>
+            </w:r>
+          </w:p>
+        </w:tc>
+        <w:tc>
+          <w:tcPr>
+            <w:tcBorders>
+              <w:top w:color="000000" w:space="0" w:sz="4" w:val="single"/>
+              <w:left w:color="000000" w:space="0" w:sz="4" w:val="single"/>
+              <w:bottom w:color="000000" w:space="0" w:sz="4" w:val="single"/>
+              <w:right w:color="000000" w:space="0" w:sz="4" w:val="single"/>
+            </w:tcBorders>
+            <w:shd w:fill="ededed" w:val="clear"/>
+            <w:tcMar>
+              <w:top w:w="60.0" w:type="dxa"/>
+              <w:left w:w="80.0" w:type="dxa"/>
+              <w:bottom w:w="60.0" w:type="dxa"/>
+              <w:right w:w="80.0" w:type="dxa"/>
+            </w:tcMar>
+            <w:vAlign w:val="center"/>
+          </w:tcPr>
+          <w:p>
+            <w:r>
+              <w:t>Attendance Monitoring / BL-22</w:t>
+            </w:r>
+          </w:p>
+        </w:tc>
+        <w:tc>
+          <w:tcPr>
+            <w:tcBorders>
+              <w:top w:color="000000" w:space="0" w:sz="4" w:val="single"/>
+              <w:left w:color="000000" w:space="0" w:sz="4" w:val="single"/>
+              <w:bottom w:color="000000" w:space="0" w:sz="4" w:val="single"/>
+              <w:right w:color="000000" w:space="0" w:sz="4" w:val="single"/>
+            </w:tcBorders>
+            <w:shd w:fill="ededed" w:val="clear"/>
+            <w:tcMar>
+              <w:top w:w="60.0" w:type="dxa"/>
+              <w:left w:w="80.0" w:type="dxa"/>
+              <w:bottom w:w="60.0" w:type="dxa"/>
+              <w:right w:w="80.0" w:type="dxa"/>
+            </w:tcMar>
+            <w:vAlign w:val="center"/>
+          </w:tcPr>
+          <w:p>
+            <w:r>
+              <w:t>Verify threshold comparison below, at, and above the threshold.</w:t>
+            </w:r>
+          </w:p>
+        </w:tc>
+        <w:tc>
+          <w:tcPr>
+            <w:tcBorders>
+              <w:top w:color="000000" w:space="0" w:sz="4" w:val="single"/>
+              <w:left w:color="000000" w:space="0" w:sz="4" w:val="single"/>
+              <w:bottom w:color="000000" w:space="0" w:sz="4" w:val="single"/>
+              <w:right w:color="000000" w:space="0" w:sz="4" w:val="single"/>
+            </w:tcBorders>
+            <w:shd w:fill="ededed" w:val="clear"/>
+            <w:tcMar>
+              <w:top w:w="60.0" w:type="dxa"/>
+              <w:left w:w="80.0" w:type="dxa"/>
+              <w:bottom w:w="60.0" w:type="dxa"/>
+              <w:right w:w="80.0" w:type="dxa"/>
+            </w:tcMar>
+            <w:vAlign w:val="center"/>
+          </w:tcPr>
+          <w:p>
+            <w:r>
+              <w:t>Admin threshold is 75%; saved records exist for three test students.</w:t>
+            </w:r>
+          </w:p>
+        </w:tc>
+        <w:tc>
+          <w:tcPr>
+            <w:tcBorders>
+              <w:top w:color="000000" w:space="0" w:sz="4" w:val="single"/>
+              <w:left w:color="000000" w:space="0" w:sz="4" w:val="single"/>
+              <w:bottom w:color="000000" w:space="0" w:sz="4" w:val="single"/>
+              <w:right w:color="000000" w:space="0" w:sz="4" w:val="single"/>
+            </w:tcBorders>
+            <w:shd w:fill="ededed" w:val="clear"/>
+            <w:tcMar>
+              <w:top w:w="60.0" w:type="dxa"/>
+              <w:left w:w="80.0" w:type="dxa"/>
+              <w:bottom w:w="60.0" w:type="dxa"/>
+              <w:right w:w="80.0" w:type="dxa"/>
+            </w:tcMar>
+            <w:vAlign w:val="center"/>
+          </w:tcPr>
+          <w:p>
+            <w:r>
+              <w:t>1: Evaluate each student's exact attendance ratio. 2: Review subject and overall shortage indicators.</w:t>
+            </w:r>
+          </w:p>
+        </w:tc>
+        <w:tc>
+          <w:tcPr>
+            <w:tcBorders>
+              <w:top w:color="000000" w:space="0" w:sz="4" w:val="single"/>
+              <w:left w:color="000000" w:space="0" w:sz="4" w:val="single"/>
+              <w:bottom w:color="000000" w:space="0" w:sz="4" w:val="single"/>
+              <w:right w:color="000000" w:space="0" w:sz="4" w:val="single"/>
+            </w:tcBorders>
+            <w:shd w:fill="ededed" w:val="clear"/>
+            <w:tcMar>
+              <w:top w:w="60.0" w:type="dxa"/>
+              <w:left w:w="80.0" w:type="dxa"/>
+              <w:bottom w:w="60.0" w:type="dxa"/>
+              <w:right w:w="80.0" w:type="dxa"/>
+            </w:tcMar>
+            <w:vAlign w:val="center"/>
+          </w:tcPr>
+          <w:p>
+            <w:r>
+              <w:t>S001 74/100; S002 75/100; S003 76/100; S004 0/0.</w:t>
+            </w:r>
+          </w:p>
+        </w:tc>
+        <w:tc>
+          <w:tcPr>
+            <w:tcBorders>
+              <w:top w:color="000000" w:space="0" w:sz="4" w:val="single"/>
+              <w:left w:color="000000" w:space="0" w:sz="4" w:val="single"/>
+              <w:bottom w:color="000000" w:space="0" w:sz="4" w:val="single"/>
+              <w:right w:color="000000" w:space="0" w:sz="4" w:val="single"/>
+            </w:tcBorders>
+            <w:shd w:fill="ededed" w:val="clear"/>
+            <w:tcMar>
+              <w:top w:w="60.0" w:type="dxa"/>
+              <w:left w:w="80.0" w:type="dxa"/>
+              <w:bottom w:w="60.0" w:type="dxa"/>
+              <w:right w:w="80.0" w:type="dxa"/>
+            </w:tcMar>
+            <w:vAlign w:val="center"/>
+          </w:tcPr>
+          <w:p>
+            <w:r>
+              <w:t>S001 is flagged; S002 and S003 are not flagged; S004 with no recorded classes is not flagged.</w:t>
+            </w:r>
+          </w:p>
+        </w:tc>
+        <w:tc>
+          <w:tcPr>
+            <w:tcBorders>
+              <w:top w:color="000000" w:space="0" w:sz="4" w:val="single"/>
+              <w:left w:color="000000" w:space="0" w:sz="4" w:val="single"/>
+              <w:bottom w:color="000000" w:space="0" w:sz="4" w:val="single"/>
+              <w:right w:color="000000" w:space="0" w:sz="4" w:val="single"/>
+            </w:tcBorders>
+            <w:shd w:fill="ededed" w:val="clear"/>
+            <w:tcMar>
+              <w:top w:w="60.0" w:type="dxa"/>
+              <w:left w:w="80.0" w:type="dxa"/>
+              <w:bottom w:w="60.0" w:type="dxa"/>
+              <w:right w:w="80.0" w:type="dxa"/>
+            </w:tcMar>
+            <w:vAlign w:val="center"/>
+          </w:tcPr>
+          <w:p>
+            <w:r/>
+          </w:p>
+        </w:tc>
+        <w:tc>
+          <w:tcPr>
+            <w:tcBorders>
+              <w:top w:color="000000" w:space="0" w:sz="4" w:val="single"/>
+              <w:left w:color="000000" w:space="0" w:sz="4" w:val="single"/>
+              <w:bottom w:color="000000" w:space="0" w:sz="4" w:val="single"/>
+              <w:right w:color="000000" w:space="0" w:sz="4" w:val="single"/>
+            </w:tcBorders>
+            <w:shd w:fill="ededed" w:val="clear"/>
+            <w:tcMar>
+              <w:top w:w="60.0" w:type="dxa"/>
+              <w:left w:w="80.0" w:type="dxa"/>
+              <w:bottom w:w="60.0" w:type="dxa"/>
+              <w:right w:w="80.0" w:type="dxa"/>
+            </w:tcMar>
+            <w:vAlign w:val="center"/>
+          </w:tcPr>
+          <w:p>
+            <w:r/>
           </w:p>
         </w:tc>
       </w:tr>
@@ -38368,307 +38166,181 @@
             <w:vAlign w:val="center"/>
           </w:tcPr>
           <w:p>
-            <w:pPr>
-              <w:rPr/>
-            </w:pPr>
-            <w:r>
-              <w:rPr>
-                <w:b w:val="1"/>
-                <w:bCs w:val="1"/>
-                <w:color w:val="000000"/>
-                <w:sz w:val="16"/>
-                <w:szCs w:val="16"/>
-                <w:rtl w:val="0"/>
-              </w:rPr>
-              <w:t xml:space="preserve">UT_10_3</w:t>
-            </w:r>
-            <w:r>
-              <w:rPr>
-                <w:rtl w:val="0"/>
-              </w:rPr>
-            </w:r>
-          </w:p>
-        </w:tc>
-        <w:tc>
-          <w:tcPr>
-            <w:tcBorders>
-              <w:top w:color="000000" w:space="0" w:sz="4" w:val="single"/>
-              <w:left w:color="000000" w:space="0" w:sz="4" w:val="single"/>
-              <w:bottom w:color="000000" w:space="0" w:sz="4" w:val="single"/>
-              <w:right w:color="000000" w:space="0" w:sz="4" w:val="single"/>
-            </w:tcBorders>
-            <w:tcMar>
-              <w:top w:w="60.0" w:type="dxa"/>
-              <w:left w:w="80.0" w:type="dxa"/>
-              <w:bottom w:w="60.0" w:type="dxa"/>
-              <w:right w:w="80.0" w:type="dxa"/>
-            </w:tcMar>
-            <w:vAlign w:val="center"/>
-          </w:tcPr>
-          <w:p>
-            <w:pPr>
-              <w:rPr/>
-            </w:pPr>
-            <w:r>
-              <w:rPr>
-                <w:b w:val="0"/>
-                <w:bCs w:val="0"/>
-                <w:color w:val="000000"/>
-                <w:sz w:val="16"/>
-                <w:szCs w:val="16"/>
-                <w:rtl w:val="0"/>
-              </w:rPr>
-              <w:t xml:space="preserve">Attendance Monitoring</w:t>
-            </w:r>
-            <w:r>
-              <w:rPr>
-                <w:rtl w:val="0"/>
-              </w:rPr>
-            </w:r>
-          </w:p>
-        </w:tc>
-        <w:tc>
-          <w:tcPr>
-            <w:tcBorders>
-              <w:top w:color="000000" w:space="0" w:sz="4" w:val="single"/>
-              <w:left w:color="000000" w:space="0" w:sz="4" w:val="single"/>
-              <w:bottom w:color="000000" w:space="0" w:sz="4" w:val="single"/>
-              <w:right w:color="000000" w:space="0" w:sz="4" w:val="single"/>
-            </w:tcBorders>
-            <w:tcMar>
-              <w:top w:w="60.0" w:type="dxa"/>
-              <w:left w:w="80.0" w:type="dxa"/>
-              <w:bottom w:w="60.0" w:type="dxa"/>
-              <w:right w:w="80.0" w:type="dxa"/>
-            </w:tcMar>
-            <w:vAlign w:val="center"/>
-          </w:tcPr>
-          <w:p>
-            <w:pPr>
-              <w:rPr/>
-            </w:pPr>
-            <w:r>
-              <w:rPr>
-                <w:b w:val="0"/>
-                <w:bCs w:val="0"/>
-                <w:color w:val="000000"/>
-                <w:sz w:val="16"/>
-                <w:szCs w:val="16"/>
-                <w:rtl w:val="0"/>
-              </w:rPr>
-              <w:t xml:space="preserve">Verify invalid threshold values are rejected (AR-12).</w:t>
-            </w:r>
-            <w:r>
-              <w:rPr>
-                <w:rtl w:val="0"/>
-              </w:rPr>
-            </w:r>
-          </w:p>
-        </w:tc>
-        <w:tc>
-          <w:tcPr>
-            <w:tcBorders>
-              <w:top w:color="000000" w:space="0" w:sz="4" w:val="single"/>
-              <w:left w:color="000000" w:space="0" w:sz="4" w:val="single"/>
-              <w:bottom w:color="000000" w:space="0" w:sz="4" w:val="single"/>
-              <w:right w:color="000000" w:space="0" w:sz="4" w:val="single"/>
-            </w:tcBorders>
-            <w:tcMar>
-              <w:top w:w="60.0" w:type="dxa"/>
-              <w:left w:w="80.0" w:type="dxa"/>
-              <w:bottom w:w="60.0" w:type="dxa"/>
-              <w:right w:w="80.0" w:type="dxa"/>
-            </w:tcMar>
-            <w:vAlign w:val="center"/>
-          </w:tcPr>
-          <w:p>
-            <w:pPr>
-              <w:rPr/>
-            </w:pPr>
-            <w:r>
-              <w:rPr>
-                <w:b w:val="0"/>
-                <w:bCs w:val="0"/>
-                <w:color w:val="000000"/>
-                <w:sz w:val="16"/>
-                <w:szCs w:val="16"/>
-                <w:rtl w:val="0"/>
-              </w:rPr>
-              <w:t xml:space="preserve">Attendance threshold is configured by the Admin (default 75%).</w:t>
-            </w:r>
-            <w:r>
-              <w:rPr>
-                <w:rtl w:val="0"/>
-              </w:rPr>
-            </w:r>
-          </w:p>
-        </w:tc>
-        <w:tc>
-          <w:tcPr>
-            <w:tcBorders>
-              <w:top w:color="000000" w:space="0" w:sz="4" w:val="single"/>
-              <w:left w:color="000000" w:space="0" w:sz="4" w:val="single"/>
-              <w:bottom w:color="000000" w:space="0" w:sz="4" w:val="single"/>
-              <w:right w:color="000000" w:space="0" w:sz="4" w:val="single"/>
-            </w:tcBorders>
-            <w:tcMar>
-              <w:top w:w="60.0" w:type="dxa"/>
-              <w:left w:w="80.0" w:type="dxa"/>
-              <w:bottom w:w="60.0" w:type="dxa"/>
-              <w:right w:w="80.0" w:type="dxa"/>
-            </w:tcMar>
-            <w:vAlign w:val="center"/>
-          </w:tcPr>
-          <w:p>
-            <w:pPr>
-              <w:rPr/>
-            </w:pPr>
-            <w:r>
-              <w:rPr>
-                <w:b w:val="0"/>
-                <w:bCs w:val="0"/>
-                <w:color w:val="000000"/>
-                <w:sz w:val="16"/>
-                <w:szCs w:val="16"/>
-                <w:rtl w:val="0"/>
-              </w:rPr>
-              <w:t xml:space="preserve">1: As Admin, open the threshold setting. 2: Enter each test value. 3: Save.</w:t>
-            </w:r>
-            <w:r>
-              <w:rPr>
-                <w:rtl w:val="0"/>
-              </w:rPr>
-            </w:r>
-          </w:p>
-        </w:tc>
-        <w:tc>
-          <w:tcPr>
-            <w:tcBorders>
-              <w:top w:color="000000" w:space="0" w:sz="4" w:val="single"/>
-              <w:left w:color="000000" w:space="0" w:sz="4" w:val="single"/>
-              <w:bottom w:color="000000" w:space="0" w:sz="4" w:val="single"/>
-              <w:right w:color="000000" w:space="0" w:sz="4" w:val="single"/>
-            </w:tcBorders>
-            <w:tcMar>
-              <w:top w:w="60.0" w:type="dxa"/>
-              <w:left w:w="80.0" w:type="dxa"/>
-              <w:bottom w:w="60.0" w:type="dxa"/>
-              <w:right w:w="80.0" w:type="dxa"/>
-            </w:tcMar>
-            <w:vAlign w:val="center"/>
-          </w:tcPr>
-          <w:p>
-            <w:pPr>
-              <w:rPr/>
-            </w:pPr>
-            <w:r>
-              <w:rPr>
-                <w:b w:val="0"/>
-                <w:bCs w:val="0"/>
-                <w:color w:val="000000"/>
-                <w:sz w:val="16"/>
-                <w:szCs w:val="16"/>
-                <w:rtl w:val="0"/>
-              </w:rPr>
-              <w:t xml:space="preserve">0, 101, 74.5, and "abc".</w:t>
-            </w:r>
-            <w:r>
-              <w:rPr>
-                <w:rtl w:val="0"/>
-              </w:rPr>
-            </w:r>
-          </w:p>
-        </w:tc>
-        <w:tc>
-          <w:tcPr>
-            <w:tcBorders>
-              <w:top w:color="000000" w:space="0" w:sz="4" w:val="single"/>
-              <w:left w:color="000000" w:space="0" w:sz="4" w:val="single"/>
-              <w:bottom w:color="000000" w:space="0" w:sz="4" w:val="single"/>
-              <w:right w:color="000000" w:space="0" w:sz="4" w:val="single"/>
-            </w:tcBorders>
-            <w:tcMar>
-              <w:top w:w="60.0" w:type="dxa"/>
-              <w:left w:w="80.0" w:type="dxa"/>
-              <w:bottom w:w="60.0" w:type="dxa"/>
-              <w:right w:w="80.0" w:type="dxa"/>
-            </w:tcMar>
-            <w:vAlign w:val="center"/>
-          </w:tcPr>
-          <w:p>
-            <w:pPr>
-              <w:rPr/>
-            </w:pPr>
-            <w:r>
-              <w:rPr>
-                <w:b w:val="0"/>
-                <w:bCs w:val="0"/>
-                <w:color w:val="000000"/>
-                <w:sz w:val="16"/>
-                <w:szCs w:val="16"/>
-                <w:rtl w:val="0"/>
-              </w:rPr>
-              <w:t xml:space="preserve">Each value is rejected with a validation message; the threshold stays at 75%.</w:t>
-            </w:r>
-            <w:r>
-              <w:rPr>
-                <w:rtl w:val="0"/>
-              </w:rPr>
-            </w:r>
-          </w:p>
-        </w:tc>
-        <w:tc>
-          <w:tcPr>
-            <w:tcBorders>
-              <w:top w:color="000000" w:space="0" w:sz="4" w:val="single"/>
-              <w:left w:color="000000" w:space="0" w:sz="4" w:val="single"/>
-              <w:bottom w:color="000000" w:space="0" w:sz="4" w:val="single"/>
-              <w:right w:color="000000" w:space="0" w:sz="4" w:val="single"/>
-            </w:tcBorders>
-            <w:tcMar>
-              <w:top w:w="60.0" w:type="dxa"/>
-              <w:left w:w="80.0" w:type="dxa"/>
-              <w:bottom w:w="60.0" w:type="dxa"/>
-              <w:right w:w="80.0" w:type="dxa"/>
-            </w:tcMar>
-            <w:vAlign w:val="center"/>
-          </w:tcPr>
-          <w:p>
-            <w:pPr>
-              <w:rPr/>
-            </w:pPr>
-            <w:r>
-              <w:rPr>
-                <w:rtl w:val="0"/>
-              </w:rPr>
-            </w:r>
-          </w:p>
-        </w:tc>
-        <w:tc>
-          <w:tcPr>
-            <w:tcBorders>
-              <w:top w:color="000000" w:space="0" w:sz="4" w:val="single"/>
-              <w:left w:color="000000" w:space="0" w:sz="4" w:val="single"/>
-              <w:bottom w:color="000000" w:space="0" w:sz="4" w:val="single"/>
-              <w:right w:color="000000" w:space="0" w:sz="4" w:val="single"/>
-            </w:tcBorders>
-            <w:tcMar>
-              <w:top w:w="60.0" w:type="dxa"/>
-              <w:left w:w="80.0" w:type="dxa"/>
-              <w:bottom w:w="60.0" w:type="dxa"/>
-              <w:right w:w="80.0" w:type="dxa"/>
-            </w:tcMar>
-            <w:vAlign w:val="center"/>
-          </w:tcPr>
-          <w:p>
-            <w:pPr>
-              <w:rPr/>
-            </w:pPr>
-            <w:r>
-              <w:rPr>
-                <w:rtl w:val="0"/>
-              </w:rPr>
-            </w:r>
+            <w:r>
+              <w:t>UT_10_3</w:t>
+            </w:r>
+          </w:p>
+        </w:tc>
+        <w:tc>
+          <w:tcPr>
+            <w:tcBorders>
+              <w:top w:color="000000" w:space="0" w:sz="4" w:val="single"/>
+              <w:left w:color="000000" w:space="0" w:sz="4" w:val="single"/>
+              <w:bottom w:color="000000" w:space="0" w:sz="4" w:val="single"/>
+              <w:right w:color="000000" w:space="0" w:sz="4" w:val="single"/>
+            </w:tcBorders>
+            <w:tcMar>
+              <w:top w:w="60.0" w:type="dxa"/>
+              <w:left w:w="80.0" w:type="dxa"/>
+              <w:bottom w:w="60.0" w:type="dxa"/>
+              <w:right w:w="80.0" w:type="dxa"/>
+            </w:tcMar>
+            <w:vAlign w:val="center"/>
+          </w:tcPr>
+          <w:p>
+            <w:r>
+              <w:t>Attendance Monitoring / BL-22</w:t>
+            </w:r>
+          </w:p>
+        </w:tc>
+        <w:tc>
+          <w:tcPr>
+            <w:tcBorders>
+              <w:top w:color="000000" w:space="0" w:sz="4" w:val="single"/>
+              <w:left w:color="000000" w:space="0" w:sz="4" w:val="single"/>
+              <w:bottom w:color="000000" w:space="0" w:sz="4" w:val="single"/>
+              <w:right w:color="000000" w:space="0" w:sz="4" w:val="single"/>
+            </w:tcBorders>
+            <w:tcMar>
+              <w:top w:w="60.0" w:type="dxa"/>
+              <w:left w:w="80.0" w:type="dxa"/>
+              <w:bottom w:w="60.0" w:type="dxa"/>
+              <w:right w:w="80.0" w:type="dxa"/>
+            </w:tcMar>
+            <w:vAlign w:val="center"/>
+          </w:tcPr>
+          <w:p>
+            <w:r>
+              <w:t>Verify invalid threshold values are rejected and do not alter the saved setting.</w:t>
+            </w:r>
+          </w:p>
+        </w:tc>
+        <w:tc>
+          <w:tcPr>
+            <w:tcBorders>
+              <w:top w:color="000000" w:space="0" w:sz="4" w:val="single"/>
+              <w:left w:color="000000" w:space="0" w:sz="4" w:val="single"/>
+              <w:bottom w:color="000000" w:space="0" w:sz="4" w:val="single"/>
+              <w:right w:color="000000" w:space="0" w:sz="4" w:val="single"/>
+            </w:tcBorders>
+            <w:tcMar>
+              <w:top w:w="60.0" w:type="dxa"/>
+              <w:left w:w="80.0" w:type="dxa"/>
+              <w:bottom w:w="60.0" w:type="dxa"/>
+              <w:right w:w="80.0" w:type="dxa"/>
+            </w:tcMar>
+            <w:vAlign w:val="center"/>
+          </w:tcPr>
+          <w:p>
+            <w:r>
+              <w:t>Admin is logged in; current threshold is 75%.</w:t>
+            </w:r>
+          </w:p>
+        </w:tc>
+        <w:tc>
+          <w:tcPr>
+            <w:tcBorders>
+              <w:top w:color="000000" w:space="0" w:sz="4" w:val="single"/>
+              <w:left w:color="000000" w:space="0" w:sz="4" w:val="single"/>
+              <w:bottom w:color="000000" w:space="0" w:sz="4" w:val="single"/>
+              <w:right w:color="000000" w:space="0" w:sz="4" w:val="single"/>
+            </w:tcBorders>
+            <w:tcMar>
+              <w:top w:w="60.0" w:type="dxa"/>
+              <w:left w:w="80.0" w:type="dxa"/>
+              <w:bottom w:w="60.0" w:type="dxa"/>
+              <w:right w:w="80.0" w:type="dxa"/>
+            </w:tcMar>
+            <w:vAlign w:val="center"/>
+          </w:tcPr>
+          <w:p>
+            <w:r>
+              <w:t>1: Open Configure attendance threshold. 2: Submit each invalid value separately. 3: Reload the page.</w:t>
+            </w:r>
+          </w:p>
+        </w:tc>
+        <w:tc>
+          <w:tcPr>
+            <w:tcBorders>
+              <w:top w:color="000000" w:space="0" w:sz="4" w:val="single"/>
+              <w:left w:color="000000" w:space="0" w:sz="4" w:val="single"/>
+              <w:bottom w:color="000000" w:space="0" w:sz="4" w:val="single"/>
+              <w:right w:color="000000" w:space="0" w:sz="4" w:val="single"/>
+            </w:tcBorders>
+            <w:tcMar>
+              <w:top w:w="60.0" w:type="dxa"/>
+              <w:left w:w="80.0" w:type="dxa"/>
+              <w:bottom w:w="60.0" w:type="dxa"/>
+              <w:right w:w="80.0" w:type="dxa"/>
+            </w:tcMar>
+            <w:vAlign w:val="center"/>
+          </w:tcPr>
+          <w:p>
+            <w:r>
+              <w:t>0, 101, 74.5, abc, blank.</w:t>
+            </w:r>
+          </w:p>
+        </w:tc>
+        <w:tc>
+          <w:tcPr>
+            <w:tcBorders>
+              <w:top w:color="000000" w:space="0" w:sz="4" w:val="single"/>
+              <w:left w:color="000000" w:space="0" w:sz="4" w:val="single"/>
+              <w:bottom w:color="000000" w:space="0" w:sz="4" w:val="single"/>
+              <w:right w:color="000000" w:space="0" w:sz="4" w:val="single"/>
+            </w:tcBorders>
+            <w:tcMar>
+              <w:top w:w="60.0" w:type="dxa"/>
+              <w:left w:w="80.0" w:type="dxa"/>
+              <w:bottom w:w="60.0" w:type="dxa"/>
+              <w:right w:w="80.0" w:type="dxa"/>
+            </w:tcMar>
+            <w:vAlign w:val="center"/>
+          </w:tcPr>
+          <w:p>
+            <w:r>
+              <w:t>Each invalid value is rejected with a validation error; the saved threshold remains 75%.</w:t>
+            </w:r>
+          </w:p>
+        </w:tc>
+        <w:tc>
+          <w:tcPr>
+            <w:tcBorders>
+              <w:top w:color="000000" w:space="0" w:sz="4" w:val="single"/>
+              <w:left w:color="000000" w:space="0" w:sz="4" w:val="single"/>
+              <w:bottom w:color="000000" w:space="0" w:sz="4" w:val="single"/>
+              <w:right w:color="000000" w:space="0" w:sz="4" w:val="single"/>
+            </w:tcBorders>
+            <w:tcMar>
+              <w:top w:w="60.0" w:type="dxa"/>
+              <w:left w:w="80.0" w:type="dxa"/>
+              <w:bottom w:w="60.0" w:type="dxa"/>
+              <w:right w:w="80.0" w:type="dxa"/>
+            </w:tcMar>
+            <w:vAlign w:val="center"/>
+          </w:tcPr>
+          <w:p>
+            <w:r/>
+          </w:p>
+        </w:tc>
+        <w:tc>
+          <w:tcPr>
+            <w:tcBorders>
+              <w:top w:color="000000" w:space="0" w:sz="4" w:val="single"/>
+              <w:left w:color="000000" w:space="0" w:sz="4" w:val="single"/>
+              <w:bottom w:color="000000" w:space="0" w:sz="4" w:val="single"/>
+              <w:right w:color="000000" w:space="0" w:sz="4" w:val="single"/>
+            </w:tcBorders>
+            <w:tcMar>
+              <w:top w:w="60.0" w:type="dxa"/>
+              <w:left w:w="80.0" w:type="dxa"/>
+              <w:bottom w:w="60.0" w:type="dxa"/>
+              <w:right w:w="80.0" w:type="dxa"/>
+            </w:tcMar>
+            <w:vAlign w:val="center"/>
+          </w:tcPr>
+          <w:p>
+            <w:r/>
           </w:p>
         </w:tc>
       </w:tr>
@@ -43957,6 +43629,182 @@
                 <w:rtl w:val="0"/>
               </w:rPr>
             </w:r>
+          </w:p>
+        </w:tc>
+      </w:tr>
+      <w:tr>
+        <w:tc>
+          <w:tcPr>
+            <w:tcW w:type="dxa" w:w="750"/>
+          </w:tcPr>
+          <w:p>
+            <w:r>
+              <w:t>IT_10_5</w:t>
+            </w:r>
+          </w:p>
+        </w:tc>
+        <w:tc>
+          <w:tcPr>
+            <w:tcW w:type="dxa" w:w="1000"/>
+          </w:tcPr>
+          <w:p>
+            <w:r>
+              <w:t>Attendance Monitoring / BL-22 / SEC-14</w:t>
+            </w:r>
+          </w:p>
+        </w:tc>
+        <w:tc>
+          <w:tcPr>
+            <w:tcW w:type="dxa" w:w="1750"/>
+          </w:tcPr>
+          <w:p>
+            <w:r>
+              <w:t>Verify only Admin can change the institution threshold.</w:t>
+            </w:r>
+          </w:p>
+        </w:tc>
+        <w:tc>
+          <w:tcPr>
+            <w:tcW w:type="dxa" w:w="1300"/>
+          </w:tcPr>
+          <w:p>
+            <w:r>
+              <w:t>Admin, Faculty, and Student test accounts exist.</w:t>
+            </w:r>
+          </w:p>
+        </w:tc>
+        <w:tc>
+          <w:tcPr>
+            <w:tcW w:type="dxa" w:w="2400"/>
+          </w:tcPr>
+          <w:p>
+            <w:r>
+              <w:t>1: Log in as Faculty and POST threshold 80. 2: Repeat as Student. 3: Log in as Admin and save 80.</w:t>
+            </w:r>
+          </w:p>
+        </w:tc>
+        <w:tc>
+          <w:tcPr>
+            <w:tcW w:type="dxa" w:w="1300"/>
+          </w:tcPr>
+          <w:p>
+            <w:r>
+              <w:t>POST value=80 for each role.</w:t>
+            </w:r>
+          </w:p>
+        </w:tc>
+        <w:tc>
+          <w:tcPr>
+            <w:tcW w:type="dxa" w:w="1650"/>
+          </w:tcPr>
+          <w:p>
+            <w:r>
+              <w:t>Faculty and Student receive HTTP 403 and the setting is unchanged; Admin can save 80 successfully.</w:t>
+            </w:r>
+          </w:p>
+        </w:tc>
+        <w:tc>
+          <w:tcPr>
+            <w:tcW w:type="dxa" w:w="750"/>
+          </w:tcPr>
+          <w:p>
+            <w:r/>
+          </w:p>
+        </w:tc>
+        <w:tc>
+          <w:tcPr>
+            <w:tcW w:type="dxa" w:w="650"/>
+          </w:tcPr>
+          <w:p>
+            <w:r/>
+          </w:p>
+        </w:tc>
+      </w:tr>
+      <w:tr>
+        <w:tc>
+          <w:tcPr>
+            <w:tcW w:type="dxa" w:w="750"/>
+          </w:tcPr>
+          <w:p>
+            <w:r>
+              <w:t>IT_10_6</w:t>
+            </w:r>
+          </w:p>
+        </w:tc>
+        <w:tc>
+          <w:tcPr>
+            <w:tcW w:type="dxa" w:w="1000"/>
+          </w:tcPr>
+          <w:p>
+            <w:r>
+              <w:t>Attendance Monitoring / BL-22</w:t>
+            </w:r>
+          </w:p>
+        </w:tc>
+        <w:tc>
+          <w:tcPr>
+            <w:tcW w:type="dxa" w:w="1750"/>
+          </w:tcPr>
+          <w:p>
+            <w:r>
+              <w:t>Verify shortage evaluation updates after attendance correction and threshold change.</w:t>
+            </w:r>
+          </w:p>
+        </w:tc>
+        <w:tc>
+          <w:tcPr>
+            <w:tcW w:type="dxa" w:w="1300"/>
+          </w:tcPr>
+          <w:p>
+            <w:r>
+              <w:t>Student S001 has 74/100 attendance; current threshold is 75%.</w:t>
+            </w:r>
+          </w:p>
+        </w:tc>
+        <w:tc>
+          <w:tcPr>
+            <w:tcW w:type="dxa" w:w="2400"/>
+          </w:tcPr>
+          <w:p>
+            <w:r>
+              <w:t>1: Confirm shortage. 2: Correct one Absent record to Present to reach 75/100. 3: Change threshold to 76%.</w:t>
+            </w:r>
+          </w:p>
+        </w:tc>
+        <w:tc>
+          <w:tcPr>
+            <w:tcW w:type="dxa" w:w="1300"/>
+          </w:tcPr>
+          <w:p>
+            <w:r>
+              <w:t>Threshold 75%, then 76%; ratios 74/100 and 75/100.</w:t>
+            </w:r>
+          </w:p>
+        </w:tc>
+        <w:tc>
+          <w:tcPr>
+            <w:tcW w:type="dxa" w:w="1650"/>
+          </w:tcPr>
+          <w:p>
+            <w:r>
+              <w:t>At 74% S001 is flagged at 75%; at exactly 75% S001 is not flagged at 75%; after threshold changes to 76%, S001 is flagged again.</w:t>
+            </w:r>
+          </w:p>
+        </w:tc>
+        <w:tc>
+          <w:tcPr>
+            <w:tcW w:type="dxa" w:w="750"/>
+          </w:tcPr>
+          <w:p>
+            <w:r/>
+          </w:p>
+        </w:tc>
+        <w:tc>
+          <w:tcPr>
+            <w:tcW w:type="dxa" w:w="650"/>
+          </w:tcPr>
+          <w:p>
+            <w:r/>
           </w:p>
         </w:tc>
       </w:tr>
@@ -47797,315 +47645,189 @@
             <w:vAlign w:val="center"/>
           </w:tcPr>
           <w:p>
-            <w:pPr>
-              <w:rPr/>
-            </w:pPr>
-            <w:r>
-              <w:rPr>
-                <w:b w:val="1"/>
-                <w:bCs w:val="1"/>
-                <w:color w:val="000000"/>
-                <w:sz w:val="16"/>
-                <w:szCs w:val="16"/>
-                <w:rtl w:val="0"/>
-              </w:rPr>
-              <w:t xml:space="preserve">UT_12_2</w:t>
-            </w:r>
-            <w:r>
-              <w:rPr>
-                <w:rtl w:val="0"/>
-              </w:rPr>
-            </w:r>
-          </w:p>
-        </w:tc>
-        <w:tc>
-          <w:tcPr>
-            <w:tcBorders>
-              <w:top w:color="000000" w:space="0" w:sz="4" w:val="single"/>
-              <w:left w:color="000000" w:space="0" w:sz="4" w:val="single"/>
-              <w:bottom w:color="000000" w:space="0" w:sz="4" w:val="single"/>
-              <w:right w:color="000000" w:space="0" w:sz="4" w:val="single"/>
-            </w:tcBorders>
-            <w:shd w:fill="ededed" w:val="clear"/>
-            <w:tcMar>
-              <w:top w:w="60.0" w:type="dxa"/>
-              <w:left w:w="80.0" w:type="dxa"/>
-              <w:bottom w:w="60.0" w:type="dxa"/>
-              <w:right w:w="80.0" w:type="dxa"/>
-            </w:tcMar>
-            <w:vAlign w:val="center"/>
-          </w:tcPr>
-          <w:p>
-            <w:pPr>
-              <w:rPr/>
-            </w:pPr>
-            <w:r>
-              <w:rPr>
-                <w:b w:val="0"/>
-                <w:bCs w:val="0"/>
-                <w:color w:val="000000"/>
-                <w:sz w:val="16"/>
-                <w:szCs w:val="16"/>
-                <w:rtl w:val="0"/>
-              </w:rPr>
-              <w:t xml:space="preserve">Dashboard / Session</w:t>
-            </w:r>
-            <w:r>
-              <w:rPr>
-                <w:rtl w:val="0"/>
-              </w:rPr>
-            </w:r>
-          </w:p>
-        </w:tc>
-        <w:tc>
-          <w:tcPr>
-            <w:tcBorders>
-              <w:top w:color="000000" w:space="0" w:sz="4" w:val="single"/>
-              <w:left w:color="000000" w:space="0" w:sz="4" w:val="single"/>
-              <w:bottom w:color="000000" w:space="0" w:sz="4" w:val="single"/>
-              <w:right w:color="000000" w:space="0" w:sz="4" w:val="single"/>
-            </w:tcBorders>
-            <w:shd w:fill="ededed" w:val="clear"/>
-            <w:tcMar>
-              <w:top w:w="60.0" w:type="dxa"/>
-              <w:left w:w="80.0" w:type="dxa"/>
-              <w:bottom w:w="60.0" w:type="dxa"/>
-              <w:right w:w="80.0" w:type="dxa"/>
-            </w:tcMar>
-            <w:vAlign w:val="center"/>
-          </w:tcPr>
-          <w:p>
-            <w:pPr>
-              <w:rPr/>
-            </w:pPr>
-            <w:r>
-              <w:rPr>
-                <w:b w:val="0"/>
-                <w:bCs w:val="0"/>
-                <w:color w:val="000000"/>
-                <w:sz w:val="16"/>
-                <w:szCs w:val="16"/>
-                <w:rtl w:val="0"/>
-              </w:rPr>
-              <w:t xml:space="preserve">Verify Dashboard &amp; Logout is rejected when a required field is left blank.</w:t>
-            </w:r>
-            <w:r>
-              <w:rPr>
-                <w:rtl w:val="0"/>
-              </w:rPr>
-            </w:r>
-          </w:p>
-        </w:tc>
-        <w:tc>
-          <w:tcPr>
-            <w:tcBorders>
-              <w:top w:color="000000" w:space="0" w:sz="4" w:val="single"/>
-              <w:left w:color="000000" w:space="0" w:sz="4" w:val="single"/>
-              <w:bottom w:color="000000" w:space="0" w:sz="4" w:val="single"/>
-              <w:right w:color="000000" w:space="0" w:sz="4" w:val="single"/>
-            </w:tcBorders>
-            <w:shd w:fill="ededed" w:val="clear"/>
-            <w:tcMar>
-              <w:top w:w="60.0" w:type="dxa"/>
-              <w:left w:w="80.0" w:type="dxa"/>
-              <w:bottom w:w="60.0" w:type="dxa"/>
-              <w:right w:w="80.0" w:type="dxa"/>
-            </w:tcMar>
-            <w:vAlign w:val="center"/>
-          </w:tcPr>
-          <w:p>
-            <w:pPr>
-              <w:rPr/>
-            </w:pPr>
-            <w:r>
-              <w:rPr>
-                <w:b w:val="0"/>
-                <w:bCs w:val="0"/>
-                <w:color w:val="000000"/>
-                <w:sz w:val="16"/>
-                <w:szCs w:val="16"/>
-                <w:rtl w:val="0"/>
-              </w:rPr>
-              <w:t xml:space="preserve">User is logged in.</w:t>
-            </w:r>
-            <w:r>
-              <w:rPr>
-                <w:rtl w:val="0"/>
-              </w:rPr>
-            </w:r>
-          </w:p>
-        </w:tc>
-        <w:tc>
-          <w:tcPr>
-            <w:tcBorders>
-              <w:top w:color="000000" w:space="0" w:sz="4" w:val="single"/>
-              <w:left w:color="000000" w:space="0" w:sz="4" w:val="single"/>
-              <w:bottom w:color="000000" w:space="0" w:sz="4" w:val="single"/>
-              <w:right w:color="000000" w:space="0" w:sz="4" w:val="single"/>
-            </w:tcBorders>
-            <w:shd w:fill="ededed" w:val="clear"/>
-            <w:tcMar>
-              <w:top w:w="60.0" w:type="dxa"/>
-              <w:left w:w="80.0" w:type="dxa"/>
-              <w:bottom w:w="60.0" w:type="dxa"/>
-              <w:right w:w="80.0" w:type="dxa"/>
-            </w:tcMar>
-            <w:vAlign w:val="center"/>
-          </w:tcPr>
-          <w:p>
-            <w:pPr>
-              <w:rPr/>
-            </w:pPr>
-            <w:r>
-              <w:rPr>
-                <w:b w:val="0"/>
-                <w:bCs w:val="0"/>
-                <w:color w:val="000000"/>
-                <w:sz w:val="16"/>
-                <w:szCs w:val="16"/>
-                <w:rtl w:val="0"/>
-              </w:rPr>
-              <w:t xml:space="preserve">1: Open the relevant form. 2: Leave a mandatory field empty. 3: Attempt to submit.</w:t>
-            </w:r>
-            <w:r>
-              <w:rPr>
-                <w:rtl w:val="0"/>
-              </w:rPr>
-            </w:r>
-          </w:p>
-        </w:tc>
-        <w:tc>
-          <w:tcPr>
-            <w:tcBorders>
-              <w:top w:color="000000" w:space="0" w:sz="4" w:val="single"/>
-              <w:left w:color="000000" w:space="0" w:sz="4" w:val="single"/>
-              <w:bottom w:color="000000" w:space="0" w:sz="4" w:val="single"/>
-              <w:right w:color="000000" w:space="0" w:sz="4" w:val="single"/>
-            </w:tcBorders>
-            <w:shd w:fill="ededed" w:val="clear"/>
-            <w:tcMar>
-              <w:top w:w="60.0" w:type="dxa"/>
-              <w:left w:w="80.0" w:type="dxa"/>
-              <w:bottom w:w="60.0" w:type="dxa"/>
-              <w:right w:w="80.0" w:type="dxa"/>
-            </w:tcMar>
-            <w:vAlign w:val="center"/>
-          </w:tcPr>
-          <w:p>
-            <w:pPr>
-              <w:rPr/>
-            </w:pPr>
-            <w:r>
-              <w:rPr>
-                <w:b w:val="0"/>
-                <w:bCs w:val="0"/>
-                <w:color w:val="000000"/>
-                <w:sz w:val="16"/>
-                <w:szCs w:val="16"/>
-                <w:rtl w:val="0"/>
-              </w:rPr>
-              <w:t xml:space="preserve">One or more required fields blank; rest valid.</w:t>
-            </w:r>
-            <w:r>
-              <w:rPr>
-                <w:rtl w:val="0"/>
-              </w:rPr>
-            </w:r>
-          </w:p>
-        </w:tc>
-        <w:tc>
-          <w:tcPr>
-            <w:tcBorders>
-              <w:top w:color="000000" w:space="0" w:sz="4" w:val="single"/>
-              <w:left w:color="000000" w:space="0" w:sz="4" w:val="single"/>
-              <w:bottom w:color="000000" w:space="0" w:sz="4" w:val="single"/>
-              <w:right w:color="000000" w:space="0" w:sz="4" w:val="single"/>
-            </w:tcBorders>
-            <w:shd w:fill="ededed" w:val="clear"/>
-            <w:tcMar>
-              <w:top w:w="60.0" w:type="dxa"/>
-              <w:left w:w="80.0" w:type="dxa"/>
-              <w:bottom w:w="60.0" w:type="dxa"/>
-              <w:right w:w="80.0" w:type="dxa"/>
-            </w:tcMar>
-            <w:vAlign w:val="center"/>
-          </w:tcPr>
-          <w:p>
-            <w:pPr>
-              <w:rPr/>
-            </w:pPr>
-            <w:r>
-              <w:rPr>
-                <w:b w:val="0"/>
-                <w:bCs w:val="0"/>
-                <w:color w:val="000000"/>
-                <w:sz w:val="16"/>
-                <w:szCs w:val="16"/>
-                <w:rtl w:val="0"/>
-              </w:rPr>
-              <w:t xml:space="preserve">System blocks submission and shows a validation error on the missing field.</w:t>
-            </w:r>
-            <w:r>
-              <w:rPr>
-                <w:rtl w:val="0"/>
-              </w:rPr>
-            </w:r>
-          </w:p>
-        </w:tc>
-        <w:tc>
-          <w:tcPr>
-            <w:tcBorders>
-              <w:top w:color="000000" w:space="0" w:sz="4" w:val="single"/>
-              <w:left w:color="000000" w:space="0" w:sz="4" w:val="single"/>
-              <w:bottom w:color="000000" w:space="0" w:sz="4" w:val="single"/>
-              <w:right w:color="000000" w:space="0" w:sz="4" w:val="single"/>
-            </w:tcBorders>
-            <w:shd w:fill="ededed" w:val="clear"/>
-            <w:tcMar>
-              <w:top w:w="60.0" w:type="dxa"/>
-              <w:left w:w="80.0" w:type="dxa"/>
-              <w:bottom w:w="60.0" w:type="dxa"/>
-              <w:right w:w="80.0" w:type="dxa"/>
-            </w:tcMar>
-            <w:vAlign w:val="center"/>
-          </w:tcPr>
-          <w:p>
-            <w:pPr>
-              <w:rPr/>
-            </w:pPr>
-            <w:r>
-              <w:rPr>
-                <w:rtl w:val="0"/>
-              </w:rPr>
-            </w:r>
-          </w:p>
-        </w:tc>
-        <w:tc>
-          <w:tcPr>
-            <w:tcBorders>
-              <w:top w:color="000000" w:space="0" w:sz="4" w:val="single"/>
-              <w:left w:color="000000" w:space="0" w:sz="4" w:val="single"/>
-              <w:bottom w:color="000000" w:space="0" w:sz="4" w:val="single"/>
-              <w:right w:color="000000" w:space="0" w:sz="4" w:val="single"/>
-            </w:tcBorders>
-            <w:shd w:fill="ededed" w:val="clear"/>
-            <w:tcMar>
-              <w:top w:w="60.0" w:type="dxa"/>
-              <w:left w:w="80.0" w:type="dxa"/>
-              <w:bottom w:w="60.0" w:type="dxa"/>
-              <w:right w:w="80.0" w:type="dxa"/>
-            </w:tcMar>
-            <w:vAlign w:val="center"/>
-          </w:tcPr>
-          <w:p>
-            <w:pPr>
-              <w:rPr/>
-            </w:pPr>
-            <w:r>
-              <w:rPr>
-                <w:rtl w:val="0"/>
-              </w:rPr>
-            </w:r>
+            <w:r>
+              <w:t>UT_12_2</w:t>
+            </w:r>
+          </w:p>
+        </w:tc>
+        <w:tc>
+          <w:tcPr>
+            <w:tcBorders>
+              <w:top w:color="000000" w:space="0" w:sz="4" w:val="single"/>
+              <w:left w:color="000000" w:space="0" w:sz="4" w:val="single"/>
+              <w:bottom w:color="000000" w:space="0" w:sz="4" w:val="single"/>
+              <w:right w:color="000000" w:space="0" w:sz="4" w:val="single"/>
+            </w:tcBorders>
+            <w:shd w:fill="ededed" w:val="clear"/>
+            <w:tcMar>
+              <w:top w:w="60.0" w:type="dxa"/>
+              <w:left w:w="80.0" w:type="dxa"/>
+              <w:bottom w:w="60.0" w:type="dxa"/>
+              <w:right w:w="80.0" w:type="dxa"/>
+            </w:tcMar>
+            <w:vAlign w:val="center"/>
+          </w:tcPr>
+          <w:p>
+            <w:r>
+              <w:t>Dashboard / Session / BL-25</w:t>
+            </w:r>
+          </w:p>
+        </w:tc>
+        <w:tc>
+          <w:tcPr>
+            <w:tcBorders>
+              <w:top w:color="000000" w:space="0" w:sz="4" w:val="single"/>
+              <w:left w:color="000000" w:space="0" w:sz="4" w:val="single"/>
+              <w:bottom w:color="000000" w:space="0" w:sz="4" w:val="single"/>
+              <w:right w:color="000000" w:space="0" w:sz="4" w:val="single"/>
+            </w:tcBorders>
+            <w:shd w:fill="ededed" w:val="clear"/>
+            <w:tcMar>
+              <w:top w:w="60.0" w:type="dxa"/>
+              <w:left w:w="80.0" w:type="dxa"/>
+              <w:bottom w:w="60.0" w:type="dxa"/>
+              <w:right w:w="80.0" w:type="dxa"/>
+            </w:tcMar>
+            <w:vAlign w:val="center"/>
+          </w:tcPr>
+          <w:p>
+            <w:r>
+              <w:t>Verify each role receives only its own dashboard and permitted statistics.</w:t>
+            </w:r>
+          </w:p>
+        </w:tc>
+        <w:tc>
+          <w:tcPr>
+            <w:tcBorders>
+              <w:top w:color="000000" w:space="0" w:sz="4" w:val="single"/>
+              <w:left w:color="000000" w:space="0" w:sz="4" w:val="single"/>
+              <w:bottom w:color="000000" w:space="0" w:sz="4" w:val="single"/>
+              <w:right w:color="000000" w:space="0" w:sz="4" w:val="single"/>
+            </w:tcBorders>
+            <w:shd w:fill="ededed" w:val="clear"/>
+            <w:tcMar>
+              <w:top w:w="60.0" w:type="dxa"/>
+              <w:left w:w="80.0" w:type="dxa"/>
+              <w:bottom w:w="60.0" w:type="dxa"/>
+              <w:right w:w="80.0" w:type="dxa"/>
+            </w:tcMar>
+            <w:vAlign w:val="center"/>
+          </w:tcPr>
+          <w:p>
+            <w:r>
+              <w:t>Admin, Faculty F001, and Student S001 test accounts exist; F001 teaches section A only.</w:t>
+            </w:r>
+          </w:p>
+        </w:tc>
+        <w:tc>
+          <w:tcPr>
+            <w:tcBorders>
+              <w:top w:color="000000" w:space="0" w:sz="4" w:val="single"/>
+              <w:left w:color="000000" w:space="0" w:sz="4" w:val="single"/>
+              <w:bottom w:color="000000" w:space="0" w:sz="4" w:val="single"/>
+              <w:right w:color="000000" w:space="0" w:sz="4" w:val="single"/>
+            </w:tcBorders>
+            <w:shd w:fill="ededed" w:val="clear"/>
+            <w:tcMar>
+              <w:top w:w="60.0" w:type="dxa"/>
+              <w:left w:w="80.0" w:type="dxa"/>
+              <w:bottom w:w="60.0" w:type="dxa"/>
+              <w:right w:w="80.0" w:type="dxa"/>
+            </w:tcMar>
+            <w:vAlign w:val="center"/>
+          </w:tcPr>
+          <w:p>
+            <w:r>
+              <w:t>1: Log in as each role. 2: Inspect dashboard metrics. 3: Attempt to open another role's dashboard directly.</w:t>
+            </w:r>
+          </w:p>
+        </w:tc>
+        <w:tc>
+          <w:tcPr>
+            <w:tcBorders>
+              <w:top w:color="000000" w:space="0" w:sz="4" w:val="single"/>
+              <w:left w:color="000000" w:space="0" w:sz="4" w:val="single"/>
+              <w:bottom w:color="000000" w:space="0" w:sz="4" w:val="single"/>
+              <w:right w:color="000000" w:space="0" w:sz="4" w:val="single"/>
+            </w:tcBorders>
+            <w:shd w:fill="ededed" w:val="clear"/>
+            <w:tcMar>
+              <w:top w:w="60.0" w:type="dxa"/>
+              <w:left w:w="80.0" w:type="dxa"/>
+              <w:bottom w:w="60.0" w:type="dxa"/>
+              <w:right w:w="80.0" w:type="dxa"/>
+            </w:tcMar>
+            <w:vAlign w:val="center"/>
+          </w:tcPr>
+          <w:p>
+            <w:r>
+              <w:t>Admin has all records; F001 has section A; S001 has own attendance only.</w:t>
+            </w:r>
+          </w:p>
+        </w:tc>
+        <w:tc>
+          <w:tcPr>
+            <w:tcBorders>
+              <w:top w:color="000000" w:space="0" w:sz="4" w:val="single"/>
+              <w:left w:color="000000" w:space="0" w:sz="4" w:val="single"/>
+              <w:bottom w:color="000000" w:space="0" w:sz="4" w:val="single"/>
+              <w:right w:color="000000" w:space="0" w:sz="4" w:val="single"/>
+            </w:tcBorders>
+            <w:shd w:fill="ededed" w:val="clear"/>
+            <w:tcMar>
+              <w:top w:w="60.0" w:type="dxa"/>
+              <w:left w:w="80.0" w:type="dxa"/>
+              <w:bottom w:w="60.0" w:type="dxa"/>
+              <w:right w:w="80.0" w:type="dxa"/>
+            </w:tcMar>
+            <w:vAlign w:val="center"/>
+          </w:tcPr>
+          <w:p>
+            <w:r>
+              <w:t>Each login redirects to the matching dashboard; Faculty metrics include only assigned classes; Student metrics include only own attendance; cross-role dashboard requests return HTTP 403.</w:t>
+            </w:r>
+          </w:p>
+        </w:tc>
+        <w:tc>
+          <w:tcPr>
+            <w:tcBorders>
+              <w:top w:color="000000" w:space="0" w:sz="4" w:val="single"/>
+              <w:left w:color="000000" w:space="0" w:sz="4" w:val="single"/>
+              <w:bottom w:color="000000" w:space="0" w:sz="4" w:val="single"/>
+              <w:right w:color="000000" w:space="0" w:sz="4" w:val="single"/>
+            </w:tcBorders>
+            <w:shd w:fill="ededed" w:val="clear"/>
+            <w:tcMar>
+              <w:top w:w="60.0" w:type="dxa"/>
+              <w:left w:w="80.0" w:type="dxa"/>
+              <w:bottom w:w="60.0" w:type="dxa"/>
+              <w:right w:w="80.0" w:type="dxa"/>
+            </w:tcMar>
+            <w:vAlign w:val="center"/>
+          </w:tcPr>
+          <w:p>
+            <w:r/>
+          </w:p>
+        </w:tc>
+        <w:tc>
+          <w:tcPr>
+            <w:tcBorders>
+              <w:top w:color="000000" w:space="0" w:sz="4" w:val="single"/>
+              <w:left w:color="000000" w:space="0" w:sz="4" w:val="single"/>
+              <w:bottom w:color="000000" w:space="0" w:sz="4" w:val="single"/>
+              <w:right w:color="000000" w:space="0" w:sz="4" w:val="single"/>
+            </w:tcBorders>
+            <w:shd w:fill="ededed" w:val="clear"/>
+            <w:tcMar>
+              <w:top w:w="60.0" w:type="dxa"/>
+              <w:left w:w="80.0" w:type="dxa"/>
+              <w:bottom w:w="60.0" w:type="dxa"/>
+              <w:right w:w="80.0" w:type="dxa"/>
+            </w:tcMar>
+            <w:vAlign w:val="center"/>
+          </w:tcPr>
+          <w:p>
+            <w:r/>
           </w:p>
         </w:tc>
       </w:tr>
@@ -48131,307 +47853,181 @@
             <w:vAlign w:val="center"/>
           </w:tcPr>
           <w:p>
-            <w:pPr>
-              <w:rPr/>
-            </w:pPr>
-            <w:r>
-              <w:rPr>
-                <w:b w:val="1"/>
-                <w:bCs w:val="1"/>
-                <w:color w:val="000000"/>
-                <w:sz w:val="16"/>
-                <w:szCs w:val="16"/>
-                <w:rtl w:val="0"/>
-              </w:rPr>
-              <w:t xml:space="preserve">UT_12_3</w:t>
-            </w:r>
-            <w:r>
-              <w:rPr>
-                <w:rtl w:val="0"/>
-              </w:rPr>
-            </w:r>
-          </w:p>
-        </w:tc>
-        <w:tc>
-          <w:tcPr>
-            <w:tcBorders>
-              <w:top w:color="000000" w:space="0" w:sz="4" w:val="single"/>
-              <w:left w:color="000000" w:space="0" w:sz="4" w:val="single"/>
-              <w:bottom w:color="000000" w:space="0" w:sz="4" w:val="single"/>
-              <w:right w:color="000000" w:space="0" w:sz="4" w:val="single"/>
-            </w:tcBorders>
-            <w:tcMar>
-              <w:top w:w="60.0" w:type="dxa"/>
-              <w:left w:w="80.0" w:type="dxa"/>
-              <w:bottom w:w="60.0" w:type="dxa"/>
-              <w:right w:w="80.0" w:type="dxa"/>
-            </w:tcMar>
-            <w:vAlign w:val="center"/>
-          </w:tcPr>
-          <w:p>
-            <w:pPr>
-              <w:rPr/>
-            </w:pPr>
-            <w:r>
-              <w:rPr>
-                <w:b w:val="0"/>
-                <w:bCs w:val="0"/>
-                <w:color w:val="000000"/>
-                <w:sz w:val="16"/>
-                <w:szCs w:val="16"/>
-                <w:rtl w:val="0"/>
-              </w:rPr>
-              <w:t xml:space="preserve">Dashboard / Session</w:t>
-            </w:r>
-            <w:r>
-              <w:rPr>
-                <w:rtl w:val="0"/>
-              </w:rPr>
-            </w:r>
-          </w:p>
-        </w:tc>
-        <w:tc>
-          <w:tcPr>
-            <w:tcBorders>
-              <w:top w:color="000000" w:space="0" w:sz="4" w:val="single"/>
-              <w:left w:color="000000" w:space="0" w:sz="4" w:val="single"/>
-              <w:bottom w:color="000000" w:space="0" w:sz="4" w:val="single"/>
-              <w:right w:color="000000" w:space="0" w:sz="4" w:val="single"/>
-            </w:tcBorders>
-            <w:tcMar>
-              <w:top w:w="60.0" w:type="dxa"/>
-              <w:left w:w="80.0" w:type="dxa"/>
-              <w:bottom w:w="60.0" w:type="dxa"/>
-              <w:right w:w="80.0" w:type="dxa"/>
-            </w:tcMar>
-            <w:vAlign w:val="center"/>
-          </w:tcPr>
-          <w:p>
-            <w:pPr>
-              <w:rPr/>
-            </w:pPr>
-            <w:r>
-              <w:rPr>
-                <w:b w:val="0"/>
-                <w:bCs w:val="0"/>
-                <w:color w:val="000000"/>
-                <w:sz w:val="16"/>
-                <w:szCs w:val="16"/>
-                <w:rtl w:val="0"/>
-              </w:rPr>
-              <w:t xml:space="preserve">Verify Dashboard &amp; Logout handles invalid/out-of-range input correctly.</w:t>
-            </w:r>
-            <w:r>
-              <w:rPr>
-                <w:rtl w:val="0"/>
-              </w:rPr>
-            </w:r>
-          </w:p>
-        </w:tc>
-        <w:tc>
-          <w:tcPr>
-            <w:tcBorders>
-              <w:top w:color="000000" w:space="0" w:sz="4" w:val="single"/>
-              <w:left w:color="000000" w:space="0" w:sz="4" w:val="single"/>
-              <w:bottom w:color="000000" w:space="0" w:sz="4" w:val="single"/>
-              <w:right w:color="000000" w:space="0" w:sz="4" w:val="single"/>
-            </w:tcBorders>
-            <w:tcMar>
-              <w:top w:w="60.0" w:type="dxa"/>
-              <w:left w:w="80.0" w:type="dxa"/>
-              <w:bottom w:w="60.0" w:type="dxa"/>
-              <w:right w:w="80.0" w:type="dxa"/>
-            </w:tcMar>
-            <w:vAlign w:val="center"/>
-          </w:tcPr>
-          <w:p>
-            <w:pPr>
-              <w:rPr/>
-            </w:pPr>
-            <w:r>
-              <w:rPr>
-                <w:b w:val="0"/>
-                <w:bCs w:val="0"/>
-                <w:color w:val="000000"/>
-                <w:sz w:val="16"/>
-                <w:szCs w:val="16"/>
-                <w:rtl w:val="0"/>
-              </w:rPr>
-              <w:t xml:space="preserve">User is logged in.</w:t>
-            </w:r>
-            <w:r>
-              <w:rPr>
-                <w:rtl w:val="0"/>
-              </w:rPr>
-            </w:r>
-          </w:p>
-        </w:tc>
-        <w:tc>
-          <w:tcPr>
-            <w:tcBorders>
-              <w:top w:color="000000" w:space="0" w:sz="4" w:val="single"/>
-              <w:left w:color="000000" w:space="0" w:sz="4" w:val="single"/>
-              <w:bottom w:color="000000" w:space="0" w:sz="4" w:val="single"/>
-              <w:right w:color="000000" w:space="0" w:sz="4" w:val="single"/>
-            </w:tcBorders>
-            <w:tcMar>
-              <w:top w:w="60.0" w:type="dxa"/>
-              <w:left w:w="80.0" w:type="dxa"/>
-              <w:bottom w:w="60.0" w:type="dxa"/>
-              <w:right w:w="80.0" w:type="dxa"/>
-            </w:tcMar>
-            <w:vAlign w:val="center"/>
-          </w:tcPr>
-          <w:p>
-            <w:pPr>
-              <w:rPr/>
-            </w:pPr>
-            <w:r>
-              <w:rPr>
-                <w:b w:val="0"/>
-                <w:bCs w:val="0"/>
-                <w:color w:val="000000"/>
-                <w:sz w:val="16"/>
-                <w:szCs w:val="16"/>
-                <w:rtl w:val="0"/>
-              </w:rPr>
-              <w:t xml:space="preserve">1: Open the relevant form. 2: Enter invalid or out-of-range data (e.g. wrong format, negative value, duplicate key). 3: Attempt to submit.</w:t>
-            </w:r>
-            <w:r>
-              <w:rPr>
-                <w:rtl w:val="0"/>
-              </w:rPr>
-            </w:r>
-          </w:p>
-        </w:tc>
-        <w:tc>
-          <w:tcPr>
-            <w:tcBorders>
-              <w:top w:color="000000" w:space="0" w:sz="4" w:val="single"/>
-              <w:left w:color="000000" w:space="0" w:sz="4" w:val="single"/>
-              <w:bottom w:color="000000" w:space="0" w:sz="4" w:val="single"/>
-              <w:right w:color="000000" w:space="0" w:sz="4" w:val="single"/>
-            </w:tcBorders>
-            <w:tcMar>
-              <w:top w:w="60.0" w:type="dxa"/>
-              <w:left w:w="80.0" w:type="dxa"/>
-              <w:bottom w:w="60.0" w:type="dxa"/>
-              <w:right w:w="80.0" w:type="dxa"/>
-            </w:tcMar>
-            <w:vAlign w:val="center"/>
-          </w:tcPr>
-          <w:p>
-            <w:pPr>
-              <w:rPr/>
-            </w:pPr>
-            <w:r>
-              <w:rPr>
-                <w:b w:val="0"/>
-                <w:bCs w:val="0"/>
-                <w:color w:val="000000"/>
-                <w:sz w:val="16"/>
-                <w:szCs w:val="16"/>
-                <w:rtl w:val="0"/>
-              </w:rPr>
-              <w:t xml:space="preserve">Deliberately invalid input, e.g. duplicate ID, malformed date, or text in a numeric field.</w:t>
-            </w:r>
-            <w:r>
-              <w:rPr>
-                <w:rtl w:val="0"/>
-              </w:rPr>
-            </w:r>
-          </w:p>
-        </w:tc>
-        <w:tc>
-          <w:tcPr>
-            <w:tcBorders>
-              <w:top w:color="000000" w:space="0" w:sz="4" w:val="single"/>
-              <w:left w:color="000000" w:space="0" w:sz="4" w:val="single"/>
-              <w:bottom w:color="000000" w:space="0" w:sz="4" w:val="single"/>
-              <w:right w:color="000000" w:space="0" w:sz="4" w:val="single"/>
-            </w:tcBorders>
-            <w:tcMar>
-              <w:top w:w="60.0" w:type="dxa"/>
-              <w:left w:w="80.0" w:type="dxa"/>
-              <w:bottom w:w="60.0" w:type="dxa"/>
-              <w:right w:w="80.0" w:type="dxa"/>
-            </w:tcMar>
-            <w:vAlign w:val="center"/>
-          </w:tcPr>
-          <w:p>
-            <w:pPr>
-              <w:rPr/>
-            </w:pPr>
-            <w:r>
-              <w:rPr>
-                <w:b w:val="0"/>
-                <w:bCs w:val="0"/>
-                <w:color w:val="000000"/>
-                <w:sz w:val="16"/>
-                <w:szCs w:val="16"/>
-                <w:rtl w:val="0"/>
-              </w:rPr>
-              <w:t xml:space="preserve">System rejects the input and displays a clear, specific error message.</w:t>
-            </w:r>
-            <w:r>
-              <w:rPr>
-                <w:rtl w:val="0"/>
-              </w:rPr>
-            </w:r>
-          </w:p>
-        </w:tc>
-        <w:tc>
-          <w:tcPr>
-            <w:tcBorders>
-              <w:top w:color="000000" w:space="0" w:sz="4" w:val="single"/>
-              <w:left w:color="000000" w:space="0" w:sz="4" w:val="single"/>
-              <w:bottom w:color="000000" w:space="0" w:sz="4" w:val="single"/>
-              <w:right w:color="000000" w:space="0" w:sz="4" w:val="single"/>
-            </w:tcBorders>
-            <w:tcMar>
-              <w:top w:w="60.0" w:type="dxa"/>
-              <w:left w:w="80.0" w:type="dxa"/>
-              <w:bottom w:w="60.0" w:type="dxa"/>
-              <w:right w:w="80.0" w:type="dxa"/>
-            </w:tcMar>
-            <w:vAlign w:val="center"/>
-          </w:tcPr>
-          <w:p>
-            <w:pPr>
-              <w:rPr/>
-            </w:pPr>
-            <w:r>
-              <w:rPr>
-                <w:rtl w:val="0"/>
-              </w:rPr>
-            </w:r>
-          </w:p>
-        </w:tc>
-        <w:tc>
-          <w:tcPr>
-            <w:tcBorders>
-              <w:top w:color="000000" w:space="0" w:sz="4" w:val="single"/>
-              <w:left w:color="000000" w:space="0" w:sz="4" w:val="single"/>
-              <w:bottom w:color="000000" w:space="0" w:sz="4" w:val="single"/>
-              <w:right w:color="000000" w:space="0" w:sz="4" w:val="single"/>
-            </w:tcBorders>
-            <w:tcMar>
-              <w:top w:w="60.0" w:type="dxa"/>
-              <w:left w:w="80.0" w:type="dxa"/>
-              <w:bottom w:w="60.0" w:type="dxa"/>
-              <w:right w:w="80.0" w:type="dxa"/>
-            </w:tcMar>
-            <w:vAlign w:val="center"/>
-          </w:tcPr>
-          <w:p>
-            <w:pPr>
-              <w:rPr/>
-            </w:pPr>
-            <w:r>
-              <w:rPr>
-                <w:rtl w:val="0"/>
-              </w:rPr>
-            </w:r>
+            <w:r>
+              <w:t>UT_12_3</w:t>
+            </w:r>
+          </w:p>
+        </w:tc>
+        <w:tc>
+          <w:tcPr>
+            <w:tcBorders>
+              <w:top w:color="000000" w:space="0" w:sz="4" w:val="single"/>
+              <w:left w:color="000000" w:space="0" w:sz="4" w:val="single"/>
+              <w:bottom w:color="000000" w:space="0" w:sz="4" w:val="single"/>
+              <w:right w:color="000000" w:space="0" w:sz="4" w:val="single"/>
+            </w:tcBorders>
+            <w:tcMar>
+              <w:top w:w="60.0" w:type="dxa"/>
+              <w:left w:w="80.0" w:type="dxa"/>
+              <w:bottom w:w="60.0" w:type="dxa"/>
+              <w:right w:w="80.0" w:type="dxa"/>
+            </w:tcMar>
+            <w:vAlign w:val="center"/>
+          </w:tcPr>
+          <w:p>
+            <w:r>
+              <w:t>Dashboard / Session / BL-25</w:t>
+            </w:r>
+          </w:p>
+        </w:tc>
+        <w:tc>
+          <w:tcPr>
+            <w:tcBorders>
+              <w:top w:color="000000" w:space="0" w:sz="4" w:val="single"/>
+              <w:left w:color="000000" w:space="0" w:sz="4" w:val="single"/>
+              <w:bottom w:color="000000" w:space="0" w:sz="4" w:val="single"/>
+              <w:right w:color="000000" w:space="0" w:sz="4" w:val="single"/>
+            </w:tcBorders>
+            <w:tcMar>
+              <w:top w:w="60.0" w:type="dxa"/>
+              <w:left w:w="80.0" w:type="dxa"/>
+              <w:bottom w:w="60.0" w:type="dxa"/>
+              <w:right w:w="80.0" w:type="dxa"/>
+            </w:tcMar>
+            <w:vAlign w:val="center"/>
+          </w:tcPr>
+          <w:p>
+            <w:r>
+              <w:t>Verify dashboards clearly represent a no-data state.</w:t>
+            </w:r>
+          </w:p>
+        </w:tc>
+        <w:tc>
+          <w:tcPr>
+            <w:tcBorders>
+              <w:top w:color="000000" w:space="0" w:sz="4" w:val="single"/>
+              <w:left w:color="000000" w:space="0" w:sz="4" w:val="single"/>
+              <w:bottom w:color="000000" w:space="0" w:sz="4" w:val="single"/>
+              <w:right w:color="000000" w:space="0" w:sz="4" w:val="single"/>
+            </w:tcBorders>
+            <w:tcMar>
+              <w:top w:w="60.0" w:type="dxa"/>
+              <w:left w:w="80.0" w:type="dxa"/>
+              <w:bottom w:w="60.0" w:type="dxa"/>
+              <w:right w:w="80.0" w:type="dxa"/>
+            </w:tcMar>
+            <w:vAlign w:val="center"/>
+          </w:tcPr>
+          <w:p>
+            <w:r>
+              <w:t>Test Admin, Faculty F003 with no assignments, and Student S003 with no attendance.</w:t>
+            </w:r>
+          </w:p>
+        </w:tc>
+        <w:tc>
+          <w:tcPr>
+            <w:tcBorders>
+              <w:top w:color="000000" w:space="0" w:sz="4" w:val="single"/>
+              <w:left w:color="000000" w:space="0" w:sz="4" w:val="single"/>
+              <w:bottom w:color="000000" w:space="0" w:sz="4" w:val="single"/>
+              <w:right w:color="000000" w:space="0" w:sz="4" w:val="single"/>
+            </w:tcBorders>
+            <w:tcMar>
+              <w:top w:w="60.0" w:type="dxa"/>
+              <w:left w:w="80.0" w:type="dxa"/>
+              <w:bottom w:w="60.0" w:type="dxa"/>
+              <w:right w:w="80.0" w:type="dxa"/>
+            </w:tcMar>
+            <w:vAlign w:val="center"/>
+          </w:tcPr>
+          <w:p>
+            <w:r>
+              <w:t>1: Sign in as each role. 2: Review counts and attendance widgets.</w:t>
+            </w:r>
+          </w:p>
+        </w:tc>
+        <w:tc>
+          <w:tcPr>
+            <w:tcBorders>
+              <w:top w:color="000000" w:space="0" w:sz="4" w:val="single"/>
+              <w:left w:color="000000" w:space="0" w:sz="4" w:val="single"/>
+              <w:bottom w:color="000000" w:space="0" w:sz="4" w:val="single"/>
+              <w:right w:color="000000" w:space="0" w:sz="4" w:val="single"/>
+            </w:tcBorders>
+            <w:tcMar>
+              <w:top w:w="60.0" w:type="dxa"/>
+              <w:left w:w="80.0" w:type="dxa"/>
+              <w:bottom w:w="60.0" w:type="dxa"/>
+              <w:right w:w="80.0" w:type="dxa"/>
+            </w:tcMar>
+            <w:vAlign w:val="center"/>
+          </w:tcPr>
+          <w:p>
+            <w:r>
+              <w:t>Zero students/sections/sessions for the empty fixture; S003 has 0 recorded classes.</w:t>
+            </w:r>
+          </w:p>
+        </w:tc>
+        <w:tc>
+          <w:tcPr>
+            <w:tcBorders>
+              <w:top w:color="000000" w:space="0" w:sz="4" w:val="single"/>
+              <w:left w:color="000000" w:space="0" w:sz="4" w:val="single"/>
+              <w:bottom w:color="000000" w:space="0" w:sz="4" w:val="single"/>
+              <w:right w:color="000000" w:space="0" w:sz="4" w:val="single"/>
+            </w:tcBorders>
+            <w:tcMar>
+              <w:top w:w="60.0" w:type="dxa"/>
+              <w:left w:w="80.0" w:type="dxa"/>
+              <w:bottom w:w="60.0" w:type="dxa"/>
+              <w:right w:w="80.0" w:type="dxa"/>
+            </w:tcMar>
+            <w:vAlign w:val="center"/>
+          </w:tcPr>
+          <w:p>
+            <w:r>
+              <w:t>Counts show 0; student attendance shows 'N/A — no classes yet'; no zero-record student is incorrectly flagged as below threshold.</w:t>
+            </w:r>
+          </w:p>
+        </w:tc>
+        <w:tc>
+          <w:tcPr>
+            <w:tcBorders>
+              <w:top w:color="000000" w:space="0" w:sz="4" w:val="single"/>
+              <w:left w:color="000000" w:space="0" w:sz="4" w:val="single"/>
+              <w:bottom w:color="000000" w:space="0" w:sz="4" w:val="single"/>
+              <w:right w:color="000000" w:space="0" w:sz="4" w:val="single"/>
+            </w:tcBorders>
+            <w:tcMar>
+              <w:top w:w="60.0" w:type="dxa"/>
+              <w:left w:w="80.0" w:type="dxa"/>
+              <w:bottom w:w="60.0" w:type="dxa"/>
+              <w:right w:w="80.0" w:type="dxa"/>
+            </w:tcMar>
+            <w:vAlign w:val="center"/>
+          </w:tcPr>
+          <w:p>
+            <w:r/>
+          </w:p>
+        </w:tc>
+        <w:tc>
+          <w:tcPr>
+            <w:tcBorders>
+              <w:top w:color="000000" w:space="0" w:sz="4" w:val="single"/>
+              <w:left w:color="000000" w:space="0" w:sz="4" w:val="single"/>
+              <w:bottom w:color="000000" w:space="0" w:sz="4" w:val="single"/>
+              <w:right w:color="000000" w:space="0" w:sz="4" w:val="single"/>
+            </w:tcBorders>
+            <w:tcMar>
+              <w:top w:w="60.0" w:type="dxa"/>
+              <w:left w:w="80.0" w:type="dxa"/>
+              <w:bottom w:w="60.0" w:type="dxa"/>
+              <w:right w:w="80.0" w:type="dxa"/>
+            </w:tcMar>
+            <w:vAlign w:val="center"/>
+          </w:tcPr>
+          <w:p>
+            <w:r/>
           </w:p>
         </w:tc>
       </w:tr>
@@ -53193,6 +52789,560 @@
         <w:rPr>
           <w:rtl w:val="0"/>
         </w:rPr>
+      </w:r>
+    </w:p>
+    <w:tbl>
+      <w:tblPr>
+        <w:tblW w:type="auto" w:w="0"/>
+        <w:tblLook w:firstColumn="1" w:firstRow="1" w:lastColumn="0" w:lastRow="0" w:noHBand="0" w:noVBand="1" w:val="04A0"/>
+      </w:tblPr>
+      <w:tblGrid>
+        <w:gridCol w:w="1249"/>
+        <w:gridCol w:w="1249"/>
+        <w:gridCol w:w="1249"/>
+        <w:gridCol w:w="1249"/>
+        <w:gridCol w:w="1249"/>
+        <w:gridCol w:w="1249"/>
+        <w:gridCol w:w="1249"/>
+        <w:gridCol w:w="1249"/>
+        <w:gridCol w:w="1249"/>
+      </w:tblGrid>
+      <w:tr>
+        <w:tc>
+          <w:tcPr>
+            <w:tcW w:type="dxa" w:w="1249"/>
+          </w:tcPr>
+          <w:p>
+            <w:r>
+              <w:t>Test Case ID</w:t>
+            </w:r>
+          </w:p>
+        </w:tc>
+        <w:tc>
+          <w:tcPr>
+            <w:tcW w:type="dxa" w:w="1249"/>
+          </w:tcPr>
+          <w:p>
+            <w:r>
+              <w:t>Module</w:t>
+            </w:r>
+          </w:p>
+        </w:tc>
+        <w:tc>
+          <w:tcPr>
+            <w:tcW w:type="dxa" w:w="1249"/>
+          </w:tcPr>
+          <w:p>
+            <w:r>
+              <w:t>Test Case Description</w:t>
+            </w:r>
+          </w:p>
+        </w:tc>
+        <w:tc>
+          <w:tcPr>
+            <w:tcW w:type="dxa" w:w="1249"/>
+          </w:tcPr>
+          <w:p>
+            <w:r>
+              <w:t>Pre-conditions</w:t>
+            </w:r>
+          </w:p>
+        </w:tc>
+        <w:tc>
+          <w:tcPr>
+            <w:tcW w:type="dxa" w:w="1249"/>
+          </w:tcPr>
+          <w:p>
+            <w:r>
+              <w:t>Test Steps</w:t>
+            </w:r>
+          </w:p>
+        </w:tc>
+        <w:tc>
+          <w:tcPr>
+            <w:tcW w:type="dxa" w:w="1249"/>
+          </w:tcPr>
+          <w:p>
+            <w:r>
+              <w:t>Test Data</w:t>
+            </w:r>
+          </w:p>
+        </w:tc>
+        <w:tc>
+          <w:tcPr>
+            <w:tcW w:type="dxa" w:w="1249"/>
+          </w:tcPr>
+          <w:p>
+            <w:r>
+              <w:t>Expected Results</w:t>
+            </w:r>
+          </w:p>
+        </w:tc>
+        <w:tc>
+          <w:tcPr>
+            <w:tcW w:type="dxa" w:w="1249"/>
+          </w:tcPr>
+          <w:p>
+            <w:r>
+              <w:t>Actual Results</w:t>
+            </w:r>
+          </w:p>
+        </w:tc>
+        <w:tc>
+          <w:tcPr>
+            <w:tcW w:type="dxa" w:w="1249"/>
+          </w:tcPr>
+          <w:p>
+            <w:r>
+              <w:t>Test Result</w:t>
+            </w:r>
+          </w:p>
+        </w:tc>
+      </w:tr>
+      <w:tr>
+        <w:tc>
+          <w:tcPr>
+            <w:tcW w:type="dxa" w:w="1249"/>
+          </w:tcPr>
+          <w:p>
+            <w:r>
+              <w:t>PT_01</w:t>
+            </w:r>
+          </w:p>
+        </w:tc>
+        <w:tc>
+          <w:tcPr>
+            <w:tcW w:type="dxa" w:w="1249"/>
+          </w:tcPr>
+          <w:p>
+            <w:r>
+              <w:t>Performance / NFR-01</w:t>
+            </w:r>
+          </w:p>
+        </w:tc>
+        <w:tc>
+          <w:tcPr>
+            <w:tcW w:type="dxa" w:w="1249"/>
+          </w:tcPr>
+          <w:p>
+            <w:r>
+              <w:t>Measure common authenticated page response time.</w:t>
+            </w:r>
+          </w:p>
+        </w:tc>
+        <w:tc>
+          <w:tcPr>
+            <w:tcW w:type="dxa" w:w="1249"/>
+          </w:tcPr>
+          <w:p>
+            <w:r>
+              <w:t>Seed representative data: 1,000 students, 60 faculty, 1 semester of sessions.</w:t>
+            </w:r>
+          </w:p>
+        </w:tc>
+        <w:tc>
+          <w:tcPr>
+            <w:tcW w:type="dxa" w:w="1249"/>
+          </w:tcPr>
+          <w:p>
+            <w:r>
+              <w:t>1: Warm up the app. 2: Run 30 requests each for student report and dashboards. 3: Record server-side response duration.</w:t>
+            </w:r>
+          </w:p>
+        </w:tc>
+        <w:tc>
+          <w:tcPr>
+            <w:tcW w:type="dxa" w:w="1249"/>
+          </w:tcPr>
+          <w:p>
+            <w:r>
+              <w:t>Staging database; 50 concurrent users; no real student data.</w:t>
+            </w:r>
+          </w:p>
+        </w:tc>
+        <w:tc>
+          <w:tcPr>
+            <w:tcW w:type="dxa" w:w="1249"/>
+          </w:tcPr>
+          <w:p>
+            <w:r>
+              <w:t>At least 95% of measured requests complete within 2 seconds; report percentiles and environment.</w:t>
+            </w:r>
+          </w:p>
+        </w:tc>
+        <w:tc>
+          <w:tcPr>
+            <w:tcW w:type="dxa" w:w="1249"/>
+          </w:tcPr>
+          <w:p>
+            <w:r/>
+          </w:p>
+        </w:tc>
+        <w:tc>
+          <w:tcPr>
+            <w:tcW w:type="dxa" w:w="1249"/>
+          </w:tcPr>
+          <w:p>
+            <w:r/>
+          </w:p>
+        </w:tc>
+      </w:tr>
+      <w:tr>
+        <w:tc>
+          <w:tcPr>
+            <w:tcW w:type="dxa" w:w="1249"/>
+          </w:tcPr>
+          <w:p>
+            <w:r>
+              <w:t>PT_02</w:t>
+            </w:r>
+          </w:p>
+        </w:tc>
+        <w:tc>
+          <w:tcPr>
+            <w:tcW w:type="dxa" w:w="1249"/>
+          </w:tcPr>
+          <w:p>
+            <w:r>
+              <w:t>Performance / NFR-02</w:t>
+            </w:r>
+          </w:p>
+        </w:tc>
+        <w:tc>
+          <w:tcPr>
+            <w:tcW w:type="dxa" w:w="1249"/>
+          </w:tcPr>
+          <w:p>
+            <w:r>
+              <w:t>Measure marking throughput for a 60-student roster.</w:t>
+            </w:r>
+          </w:p>
+        </w:tc>
+        <w:tc>
+          <w:tcPr>
+            <w:tcW w:type="dxa" w:w="1249"/>
+          </w:tcPr>
+          <w:p>
+            <w:r>
+              <w:t>One faculty account is assigned to a class with 60 active enrolled students.</w:t>
+            </w:r>
+          </w:p>
+        </w:tc>
+        <w:tc>
+          <w:tcPr>
+            <w:tcW w:type="dxa" w:w="1249"/>
+          </w:tcPr>
+          <w:p>
+            <w:r>
+              <w:t>Submit one complete attendance sheet and measure server-side duration.</w:t>
+            </w:r>
+          </w:p>
+        </w:tc>
+        <w:tc>
+          <w:tcPr>
+            <w:tcW w:type="dxa" w:w="1249"/>
+          </w:tcPr>
+          <w:p>
+            <w:r>
+              <w:t>60 students; one session; every student Present or Absent.</w:t>
+            </w:r>
+          </w:p>
+        </w:tc>
+        <w:tc>
+          <w:tcPr>
+            <w:tcW w:type="dxa" w:w="1249"/>
+          </w:tcPr>
+          <w:p>
+            <w:r>
+              <w:t>Successful save completes within 3 seconds; exactly 60 records are persisted.</w:t>
+            </w:r>
+          </w:p>
+        </w:tc>
+        <w:tc>
+          <w:tcPr>
+            <w:tcW w:type="dxa" w:w="1249"/>
+          </w:tcPr>
+          <w:p>
+            <w:r/>
+          </w:p>
+        </w:tc>
+        <w:tc>
+          <w:tcPr>
+            <w:tcW w:type="dxa" w:w="1249"/>
+          </w:tcPr>
+          <w:p>
+            <w:r/>
+          </w:p>
+        </w:tc>
+      </w:tr>
+      <w:tr>
+        <w:tc>
+          <w:tcPr>
+            <w:tcW w:type="dxa" w:w="1249"/>
+          </w:tcPr>
+          <w:p>
+            <w:r>
+              <w:t>PT_03</w:t>
+            </w:r>
+          </w:p>
+        </w:tc>
+        <w:tc>
+          <w:tcPr>
+            <w:tcW w:type="dxa" w:w="1249"/>
+          </w:tcPr>
+          <w:p>
+            <w:r>
+              <w:t>Performance / NFR-03</w:t>
+            </w:r>
+          </w:p>
+        </w:tc>
+        <w:tc>
+          <w:tcPr>
+            <w:tcW w:type="dxa" w:w="1249"/>
+          </w:tcPr>
+          <w:p>
+            <w:r>
+              <w:t>Measure one-semester section report generation.</w:t>
+            </w:r>
+          </w:p>
+        </w:tc>
+        <w:tc>
+          <w:tcPr>
+            <w:tcW w:type="dxa" w:w="1249"/>
+          </w:tcPr>
+          <w:p>
+            <w:r>
+              <w:t>Section has representative attendance data for one semester.</w:t>
+            </w:r>
+          </w:p>
+        </w:tc>
+        <w:tc>
+          <w:tcPr>
+            <w:tcW w:type="dxa" w:w="1249"/>
+          </w:tcPr>
+          <w:p>
+            <w:r>
+              <w:t>Generate the section report and measure end-to-end server-side duration.</w:t>
+            </w:r>
+          </w:p>
+        </w:tc>
+        <w:tc>
+          <w:tcPr>
+            <w:tcW w:type="dxa" w:w="1249"/>
+          </w:tcPr>
+          <w:p>
+            <w:r>
+              <w:t>One semester; one section; synthetic student roster.</w:t>
+            </w:r>
+          </w:p>
+        </w:tc>
+        <w:tc>
+          <w:tcPr>
+            <w:tcW w:type="dxa" w:w="1249"/>
+          </w:tcPr>
+          <w:p>
+            <w:r>
+              <w:t>Report generation completes within 10 seconds.</w:t>
+            </w:r>
+          </w:p>
+        </w:tc>
+        <w:tc>
+          <w:tcPr>
+            <w:tcW w:type="dxa" w:w="1249"/>
+          </w:tcPr>
+          <w:p>
+            <w:r/>
+          </w:p>
+        </w:tc>
+        <w:tc>
+          <w:tcPr>
+            <w:tcW w:type="dxa" w:w="1249"/>
+          </w:tcPr>
+          <w:p>
+            <w:r/>
+          </w:p>
+        </w:tc>
+      </w:tr>
+      <w:tr>
+        <w:tc>
+          <w:tcPr>
+            <w:tcW w:type="dxa" w:w="1249"/>
+          </w:tcPr>
+          <w:p>
+            <w:r>
+              <w:t>PT_04</w:t>
+            </w:r>
+          </w:p>
+        </w:tc>
+        <w:tc>
+          <w:tcPr>
+            <w:tcW w:type="dxa" w:w="1249"/>
+          </w:tcPr>
+          <w:p>
+            <w:r>
+              <w:t>Capacity / NFR-04</w:t>
+            </w:r>
+          </w:p>
+        </w:tc>
+        <w:tc>
+          <w:tcPr>
+            <w:tcW w:type="dxa" w:w="1249"/>
+          </w:tcPr>
+          <w:p>
+            <w:r>
+              <w:t>Check expected data capacity and 50 concurrent users.</w:t>
+            </w:r>
+          </w:p>
+        </w:tc>
+        <w:tc>
+          <w:tcPr>
+            <w:tcW w:type="dxa" w:w="1249"/>
+          </w:tcPr>
+          <w:p>
+            <w:r>
+              <w:t>Staging environment mirrors production configuration.</w:t>
+            </w:r>
+          </w:p>
+        </w:tc>
+        <w:tc>
+          <w:tcPr>
+            <w:tcW w:type="dxa" w:w="1249"/>
+          </w:tcPr>
+          <w:p>
+            <w:r>
+              <w:t>Load 1,000 synthetic students, 60 synthetic faculty, then run 50 concurrent authenticated sessions.</w:t>
+            </w:r>
+          </w:p>
+        </w:tc>
+        <w:tc>
+          <w:tcPr>
+            <w:tcW w:type="dxa" w:w="1249"/>
+          </w:tcPr>
+          <w:p>
+            <w:r>
+              <w:t>Synthetic data only; 50 concurrent users.</w:t>
+            </w:r>
+          </w:p>
+        </w:tc>
+        <w:tc>
+          <w:tcPr>
+            <w:tcW w:type="dxa" w:w="1249"/>
+          </w:tcPr>
+          <w:p>
+            <w:r>
+              <w:t>No data leakage, unhandled server errors, or integrity violations; record latency and resource use.</w:t>
+            </w:r>
+          </w:p>
+        </w:tc>
+        <w:tc>
+          <w:tcPr>
+            <w:tcW w:type="dxa" w:w="1249"/>
+          </w:tcPr>
+          <w:p>
+            <w:r/>
+          </w:p>
+        </w:tc>
+        <w:tc>
+          <w:tcPr>
+            <w:tcW w:type="dxa" w:w="1249"/>
+          </w:tcPr>
+          <w:p>
+            <w:r/>
+          </w:p>
+        </w:tc>
+      </w:tr>
+      <w:tr>
+        <w:tc>
+          <w:tcPr>
+            <w:tcW w:type="dxa" w:w="1249"/>
+          </w:tcPr>
+          <w:p>
+            <w:r>
+              <w:t>ST_15_1</w:t>
+            </w:r>
+          </w:p>
+        </w:tc>
+        <w:tc>
+          <w:tcPr>
+            <w:tcW w:type="dxa" w:w="1249"/>
+          </w:tcPr>
+          <w:p>
+            <w:r>
+              <w:t>Dashboard / BL-25 / FR-17 / UC-12</w:t>
+            </w:r>
+          </w:p>
+        </w:tc>
+        <w:tc>
+          <w:tcPr>
+            <w:tcW w:type="dxa" w:w="1249"/>
+          </w:tcPr>
+          <w:p>
+            <w:r>
+              <w:t>Verify attendance changes update dashboard statistics.</w:t>
+            </w:r>
+          </w:p>
+        </w:tc>
+        <w:tc>
+          <w:tcPr>
+            <w:tcW w:type="dxa" w:w="1249"/>
+          </w:tcPr>
+          <w:p>
+            <w:r>
+              <w:t>Student S001 has one saved attendance record and dashboard is available.</w:t>
+            </w:r>
+          </w:p>
+        </w:tc>
+        <w:tc>
+          <w:tcPr>
+            <w:tcW w:type="dxa" w:w="1249"/>
+          </w:tcPr>
+          <w:p>
+            <w:r>
+              <w:t>1: Load dashboard. 2: Change the saved attendance status using the authorized test workflow. 3: Reload dashboard.</w:t>
+            </w:r>
+          </w:p>
+        </w:tc>
+        <w:tc>
+          <w:tcPr>
+            <w:tcW w:type="dxa" w:w="1249"/>
+          </w:tcPr>
+          <w:p>
+            <w:r>
+              <w:t>Change S001 from Absent to Present.</w:t>
+            </w:r>
+          </w:p>
+        </w:tc>
+        <w:tc>
+          <w:tcPr>
+            <w:tcW w:type="dxa" w:w="1249"/>
+          </w:tcPr>
+          <w:p>
+            <w:r>
+              <w:t>The overall percentage and shortage indicators reflect the latest saved record without stale cached values.</w:t>
+            </w:r>
+          </w:p>
+        </w:tc>
+        <w:tc>
+          <w:tcPr>
+            <w:tcW w:type="dxa" w:w="1249"/>
+          </w:tcPr>
+          <w:p>
+            <w:r/>
+          </w:p>
+        </w:tc>
+        <w:tc>
+          <w:tcPr>
+            <w:tcW w:type="dxa" w:w="1249"/>
+          </w:tcPr>
+          <w:p>
+            <w:r/>
+          </w:p>
+        </w:tc>
+      </w:tr>
+    </w:tbl>
+    <w:p>
+      <w:r>
+        <w:t>BL-28 coverage note: Test data identifiers are fictional. Execute performance tests in a controlled staging environment and record environment, sample size, median, p95, and failures in the Actual Results column.</w:t>
       </w:r>
     </w:p>
     <w:sectPr>

</xml_diff>